<commit_message>
feat: finalize full vertical-slice migration and project-wide cleanup (mobile/backend/web)
</commit_message>
<xml_diff>
--- a/docs/FullRegressionReport_BookBud.docx
+++ b/docs/FullRegressionReport_BookBud.docx
@@ -247,31 +247,39 @@
         <w:jc w:val="center"/>
         <w:rPr>
           <w:rFonts w:asciiTheme="majorHAnsi" w:hAnsiTheme="majorHAnsi"/>
+          <w:i/>
+          <w:iCs/>
+          <w:color w:val="0070C0"/>
+          <w:u w:val="single"/>
         </w:rPr>
       </w:pPr>
-      <w:hyperlink r:id="rId10" w:history="1">
-        <w:r>
-          <w:rPr>
-            <w:rStyle w:val="Hyperlink"/>
-            <w:rFonts w:asciiTheme="majorHAnsi" w:hAnsiTheme="majorHAnsi"/>
-            <w:i/>
-            <w:iCs/>
-            <w:sz w:val="22"/>
-            <w:szCs w:val="22"/>
-          </w:rPr>
-          <w:t>[GitHub Repository URL]</w:t>
-        </w:r>
-      </w:hyperlink>
+      <w:r>
+        <w:rPr>
+          <w:i/>
+          <w:iCs/>
+          <w:color w:val="0070C0"/>
+          <w:u w:val="single"/>
+        </w:rPr>
+        <w:t>https://github.com/NicoJohnColo/IT342-Colo-BookBud.git</w:t>
+      </w:r>
     </w:p>
     <w:p>
       <w:pPr>
         <w:rPr>
           <w:rFonts w:asciiTheme="majorHAnsi" w:hAnsiTheme="majorHAnsi"/>
+          <w:i/>
+          <w:iCs/>
+          <w:color w:val="0070C0"/>
+          <w:u w:val="single"/>
         </w:rPr>
       </w:pPr>
       <w:r>
         <w:rPr>
           <w:rFonts w:asciiTheme="majorHAnsi" w:hAnsiTheme="majorHAnsi"/>
+          <w:i/>
+          <w:iCs/>
+          <w:color w:val="0070C0"/>
+          <w:u w:val="single"/>
         </w:rPr>
         <w:br w:type="page"/>
       </w:r>
@@ -517,19 +525,32 @@
             <w:pPr>
               <w:rPr>
                 <w:rFonts w:asciiTheme="majorHAnsi" w:hAnsiTheme="majorHAnsi"/>
-              </w:rPr>
-            </w:pPr>
-            <w:hyperlink r:id="rId11" w:history="1">
-              <w:r>
-                <w:rPr>
-                  <w:rStyle w:val="Hyperlink"/>
-                  <w:rFonts w:asciiTheme="majorHAnsi" w:hAnsiTheme="majorHAnsi"/>
-                  <w:i/>
-                  <w:iCs/>
-                </w:rPr>
-                <w:t>[GitHub Repository URL]</w:t>
-              </w:r>
-            </w:hyperlink>
+                <w:i/>
+                <w:iCs/>
+                <w:color w:val="0070C0"/>
+                <w:u w:val="single"/>
+              </w:rPr>
+            </w:pPr>
+            <w:r>
+              <w:rPr>
+                <w:i/>
+                <w:iCs/>
+                <w:color w:val="0070C0"/>
+                <w:u w:val="single"/>
+              </w:rPr>
+              <w:t>https://github.com/NicoJohnColo/IT342-Colo-BookBud.git</w:t>
+            </w:r>
+          </w:p>
+          <w:p>
+            <w:pPr>
+              <w:rPr>
+                <w:rFonts w:asciiTheme="majorHAnsi" w:hAnsiTheme="majorHAnsi"/>
+                <w:i/>
+                <w:iCs/>
+                <w:color w:val="0070C0"/>
+                <w:u w:val="single"/>
+              </w:rPr>
+            </w:pPr>
           </w:p>
         </w:tc>
       </w:tr>
@@ -1254,7 +1275,7 @@
                 <w:sz w:val="19"/>
                 <w:szCs w:val="19"/>
               </w:rPr>
-              <w:t>InventoryPro</w:t>
+              <w:t>Bookbud</w:t>
             </w:r>
             <w:proofErr w:type="spellEnd"/>
             <w:r>
@@ -1266,7 +1287,18 @@
                 <w:sz w:val="19"/>
                 <w:szCs w:val="19"/>
               </w:rPr>
-              <w:t xml:space="preserve"> project from traditional layer-based architecture to Vertical Slice Architecture. The refactor involved systematically moving all backend and frontend files into feature-specific directories (features/books, features/users, features/transactions, features/payments, features/notifications, features/</w:t>
+              <w:t xml:space="preserve"> </w:t>
+            </w:r>
+            <w:r>
+              <w:rPr>
+                <w:rFonts w:asciiTheme="majorHAnsi" w:hAnsiTheme="majorHAnsi"/>
+                <w:i/>
+                <w:iCs/>
+                <w:color w:val="888888"/>
+                <w:sz w:val="19"/>
+                <w:szCs w:val="19"/>
+              </w:rPr>
+              <w:t>o project from traditional layer-based architecture to Vertical Slice Architecture. The refactor involved systematically moving all backend and frontend files into feature-specific directories (features/books, features/users, features/transactions, features/payments, features/notifications, features/</w:t>
             </w:r>
             <w:proofErr w:type="spellStart"/>
             <w:r>
@@ -5450,7 +5482,7 @@
                           </pic:cNvPicPr>
                         </pic:nvPicPr>
                         <pic:blipFill>
-                          <a:blip r:embed="rId12">
+                          <a:blip r:embed="rId10">
                             <a:extLst>
                               <a:ext uri="{28A0092B-C50C-407E-A947-70E740481C1C}">
                                 <a14:useLocalDpi xmlns:a14="http://schemas.microsoft.com/office/drawing/2010/main" val="0"/>
@@ -7480,7 +7512,7 @@
                           </pic:cNvPicPr>
                         </pic:nvPicPr>
                         <pic:blipFill>
-                          <a:blip r:embed="rId13">
+                          <a:blip r:embed="rId11">
                             <a:extLst>
                               <a:ext uri="{28A0092B-C50C-407E-A947-70E740481C1C}">
                                 <a14:useLocalDpi xmlns:a14="http://schemas.microsoft.com/office/drawing/2010/main" val="0"/>
@@ -11382,7 +11414,7 @@
                           <pic:cNvPicPr/>
                         </pic:nvPicPr>
                         <pic:blipFill>
-                          <a:blip r:embed="rId14"/>
+                          <a:blip r:embed="rId12"/>
                           <a:stretch>
                             <a:fillRect/>
                           </a:stretch>
@@ -14230,7 +14262,7 @@
                           <pic:cNvPicPr/>
                         </pic:nvPicPr>
                         <pic:blipFill>
-                          <a:blip r:embed="rId15"/>
+                          <a:blip r:embed="rId13"/>
                           <a:stretch>
                             <a:fillRect/>
                           </a:stretch>
@@ -16585,6 +16617,7 @@
           <w:rFonts w:asciiTheme="majorHAnsi" w:hAnsiTheme="majorHAnsi"/>
         </w:rPr>
       </w:pPr>
+      <w:proofErr w:type="gramStart"/>
       <w:r>
         <w:rPr>
           <w:rFonts w:asciiTheme="majorHAnsi" w:hAnsiTheme="majorHAnsi"/>
@@ -16594,7 +16627,41 @@
           <w:sz w:val="18"/>
           <w:szCs w:val="18"/>
         </w:rPr>
-        <w:t>26 test cases covering all 22 functional requirements.</w:t>
+        <w:t>2</w:t>
+      </w:r>
+      <w:r>
+        <w:rPr>
+          <w:rFonts w:asciiTheme="majorHAnsi" w:hAnsiTheme="majorHAnsi"/>
+          <w:i/>
+          <w:iCs/>
+          <w:color w:val="555555"/>
+          <w:sz w:val="18"/>
+          <w:szCs w:val="18"/>
+        </w:rPr>
+        <w:t xml:space="preserve">5 </w:t>
+      </w:r>
+      <w:r>
+        <w:rPr>
+          <w:rFonts w:asciiTheme="majorHAnsi" w:hAnsiTheme="majorHAnsi"/>
+          <w:i/>
+          <w:iCs/>
+          <w:color w:val="555555"/>
+          <w:sz w:val="18"/>
+          <w:szCs w:val="18"/>
+        </w:rPr>
+        <w:t xml:space="preserve"> test</w:t>
+      </w:r>
+      <w:proofErr w:type="gramEnd"/>
+      <w:r>
+        <w:rPr>
+          <w:rFonts w:asciiTheme="majorHAnsi" w:hAnsiTheme="majorHAnsi"/>
+          <w:i/>
+          <w:iCs/>
+          <w:color w:val="555555"/>
+          <w:sz w:val="18"/>
+          <w:szCs w:val="18"/>
+        </w:rPr>
+        <w:t xml:space="preserve"> cases covering all 22 functional requirements.</w:t>
       </w:r>
     </w:p>
     <w:p>
@@ -16632,7 +16699,7 @@
       <w:tr>
         <w:tc>
           <w:tcPr>
-            <w:tcW w:w="1000" w:type="dxa"/>
+            <w:tcW w:w="1119" w:type="dxa"/>
             <w:shd w:val="clear" w:color="auto" w:fill="000000"/>
             <w:tcMar>
               <w:top w:w="100" w:type="dxa"/>
@@ -16662,7 +16729,7 @@
         </w:tc>
         <w:tc>
           <w:tcPr>
-            <w:tcW w:w="1000" w:type="dxa"/>
+            <w:tcW w:w="1120" w:type="dxa"/>
             <w:shd w:val="clear" w:color="auto" w:fill="000000"/>
             <w:tcMar>
               <w:top w:w="100" w:type="dxa"/>
@@ -16692,7 +16759,7 @@
         </w:tc>
         <w:tc>
           <w:tcPr>
-            <w:tcW w:w="3000" w:type="dxa"/>
+            <w:tcW w:w="3359" w:type="dxa"/>
             <w:shd w:val="clear" w:color="auto" w:fill="000000"/>
             <w:tcMar>
               <w:top w:w="100" w:type="dxa"/>
@@ -16722,7 +16789,7 @@
         </w:tc>
         <w:tc>
           <w:tcPr>
-            <w:tcW w:w="2360" w:type="dxa"/>
+            <w:tcW w:w="2642" w:type="dxa"/>
             <w:shd w:val="clear" w:color="auto" w:fill="000000"/>
             <w:tcMar>
               <w:top w:w="100" w:type="dxa"/>
@@ -16752,7 +16819,7 @@
         </w:tc>
         <w:tc>
           <w:tcPr>
-            <w:tcW w:w="1000" w:type="dxa"/>
+            <w:tcW w:w="1120" w:type="dxa"/>
             <w:shd w:val="clear" w:color="auto" w:fill="000000"/>
             <w:tcMar>
               <w:top w:w="100" w:type="dxa"/>
@@ -16784,7 +16851,7 @@
       <w:tr>
         <w:tc>
           <w:tcPr>
-            <w:tcW w:w="1000" w:type="dxa"/>
+            <w:tcW w:w="1119" w:type="dxa"/>
             <w:shd w:val="clear" w:color="auto" w:fill="FFFFFF"/>
             <w:tcMar>
               <w:top w:w="80" w:type="dxa"/>
@@ -16816,7 +16883,7 @@
         </w:tc>
         <w:tc>
           <w:tcPr>
-            <w:tcW w:w="1000" w:type="dxa"/>
+            <w:tcW w:w="1120" w:type="dxa"/>
             <w:shd w:val="clear" w:color="auto" w:fill="FFFFFF"/>
             <w:tcMar>
               <w:top w:w="80" w:type="dxa"/>
@@ -16846,7 +16913,7 @@
         </w:tc>
         <w:tc>
           <w:tcPr>
-            <w:tcW w:w="3000" w:type="dxa"/>
+            <w:tcW w:w="3359" w:type="dxa"/>
             <w:shd w:val="clear" w:color="auto" w:fill="FFFFFF"/>
             <w:tcMar>
               <w:top w:w="80" w:type="dxa"/>
@@ -16875,7 +16942,7 @@
         </w:tc>
         <w:tc>
           <w:tcPr>
-            <w:tcW w:w="2360" w:type="dxa"/>
+            <w:tcW w:w="2642" w:type="dxa"/>
             <w:shd w:val="clear" w:color="auto" w:fill="FFFFFF"/>
             <w:tcMar>
               <w:top w:w="80" w:type="dxa"/>
@@ -16904,7 +16971,7 @@
         </w:tc>
         <w:tc>
           <w:tcPr>
-            <w:tcW w:w="1000" w:type="dxa"/>
+            <w:tcW w:w="1120" w:type="dxa"/>
             <w:shd w:val="clear" w:color="auto" w:fill="FFFFFF"/>
             <w:tcMar>
               <w:top w:w="80" w:type="dxa"/>
@@ -16936,7 +17003,7 @@
       <w:tr>
         <w:tc>
           <w:tcPr>
-            <w:tcW w:w="1000" w:type="dxa"/>
+            <w:tcW w:w="1119" w:type="dxa"/>
             <w:shd w:val="clear" w:color="auto" w:fill="F2F2F2"/>
             <w:tcMar>
               <w:top w:w="80" w:type="dxa"/>
@@ -16968,7 +17035,7 @@
         </w:tc>
         <w:tc>
           <w:tcPr>
-            <w:tcW w:w="1000" w:type="dxa"/>
+            <w:tcW w:w="1120" w:type="dxa"/>
             <w:shd w:val="clear" w:color="auto" w:fill="F2F2F2"/>
             <w:tcMar>
               <w:top w:w="80" w:type="dxa"/>
@@ -16998,7 +17065,7 @@
         </w:tc>
         <w:tc>
           <w:tcPr>
-            <w:tcW w:w="3000" w:type="dxa"/>
+            <w:tcW w:w="3359" w:type="dxa"/>
             <w:shd w:val="clear" w:color="auto" w:fill="F2F2F2"/>
             <w:tcMar>
               <w:top w:w="80" w:type="dxa"/>
@@ -17027,7 +17094,7 @@
         </w:tc>
         <w:tc>
           <w:tcPr>
-            <w:tcW w:w="2360" w:type="dxa"/>
+            <w:tcW w:w="2642" w:type="dxa"/>
             <w:shd w:val="clear" w:color="auto" w:fill="F2F2F2"/>
             <w:tcMar>
               <w:top w:w="80" w:type="dxa"/>
@@ -17056,7 +17123,7 @@
         </w:tc>
         <w:tc>
           <w:tcPr>
-            <w:tcW w:w="1000" w:type="dxa"/>
+            <w:tcW w:w="1120" w:type="dxa"/>
             <w:shd w:val="clear" w:color="auto" w:fill="F2F2F2"/>
             <w:tcMar>
               <w:top w:w="80" w:type="dxa"/>
@@ -17088,7 +17155,7 @@
       <w:tr>
         <w:tc>
           <w:tcPr>
-            <w:tcW w:w="1000" w:type="dxa"/>
+            <w:tcW w:w="1119" w:type="dxa"/>
             <w:shd w:val="clear" w:color="auto" w:fill="FFFFFF"/>
             <w:tcMar>
               <w:top w:w="80" w:type="dxa"/>
@@ -17120,7 +17187,7 @@
         </w:tc>
         <w:tc>
           <w:tcPr>
-            <w:tcW w:w="1000" w:type="dxa"/>
+            <w:tcW w:w="1120" w:type="dxa"/>
             <w:shd w:val="clear" w:color="auto" w:fill="FFFFFF"/>
             <w:tcMar>
               <w:top w:w="80" w:type="dxa"/>
@@ -17150,7 +17217,7 @@
         </w:tc>
         <w:tc>
           <w:tcPr>
-            <w:tcW w:w="3000" w:type="dxa"/>
+            <w:tcW w:w="3359" w:type="dxa"/>
             <w:shd w:val="clear" w:color="auto" w:fill="FFFFFF"/>
             <w:tcMar>
               <w:top w:w="80" w:type="dxa"/>
@@ -17179,7 +17246,7 @@
         </w:tc>
         <w:tc>
           <w:tcPr>
-            <w:tcW w:w="2360" w:type="dxa"/>
+            <w:tcW w:w="2642" w:type="dxa"/>
             <w:shd w:val="clear" w:color="auto" w:fill="FFFFFF"/>
             <w:tcMar>
               <w:top w:w="80" w:type="dxa"/>
@@ -17208,7 +17275,7 @@
         </w:tc>
         <w:tc>
           <w:tcPr>
-            <w:tcW w:w="1000" w:type="dxa"/>
+            <w:tcW w:w="1120" w:type="dxa"/>
             <w:shd w:val="clear" w:color="auto" w:fill="FFFFFF"/>
             <w:tcMar>
               <w:top w:w="80" w:type="dxa"/>
@@ -17240,7 +17307,7 @@
       <w:tr>
         <w:tc>
           <w:tcPr>
-            <w:tcW w:w="1000" w:type="dxa"/>
+            <w:tcW w:w="1119" w:type="dxa"/>
             <w:shd w:val="clear" w:color="auto" w:fill="F2F2F2"/>
             <w:tcMar>
               <w:top w:w="80" w:type="dxa"/>
@@ -17272,7 +17339,7 @@
         </w:tc>
         <w:tc>
           <w:tcPr>
-            <w:tcW w:w="1000" w:type="dxa"/>
+            <w:tcW w:w="1120" w:type="dxa"/>
             <w:shd w:val="clear" w:color="auto" w:fill="F2F2F2"/>
             <w:tcMar>
               <w:top w:w="80" w:type="dxa"/>
@@ -17302,7 +17369,7 @@
         </w:tc>
         <w:tc>
           <w:tcPr>
-            <w:tcW w:w="3000" w:type="dxa"/>
+            <w:tcW w:w="3359" w:type="dxa"/>
             <w:shd w:val="clear" w:color="auto" w:fill="F2F2F2"/>
             <w:tcMar>
               <w:top w:w="80" w:type="dxa"/>
@@ -17331,7 +17398,7 @@
         </w:tc>
         <w:tc>
           <w:tcPr>
-            <w:tcW w:w="2360" w:type="dxa"/>
+            <w:tcW w:w="2642" w:type="dxa"/>
             <w:shd w:val="clear" w:color="auto" w:fill="F2F2F2"/>
             <w:tcMar>
               <w:top w:w="80" w:type="dxa"/>
@@ -17360,7 +17427,7 @@
         </w:tc>
         <w:tc>
           <w:tcPr>
-            <w:tcW w:w="1000" w:type="dxa"/>
+            <w:tcW w:w="1120" w:type="dxa"/>
             <w:shd w:val="clear" w:color="auto" w:fill="F2F2F2"/>
             <w:tcMar>
               <w:top w:w="80" w:type="dxa"/>
@@ -17392,7 +17459,7 @@
       <w:tr>
         <w:tc>
           <w:tcPr>
-            <w:tcW w:w="1000" w:type="dxa"/>
+            <w:tcW w:w="1119" w:type="dxa"/>
             <w:shd w:val="clear" w:color="auto" w:fill="FFFFFF"/>
             <w:tcMar>
               <w:top w:w="80" w:type="dxa"/>
@@ -17424,7 +17491,7 @@
         </w:tc>
         <w:tc>
           <w:tcPr>
-            <w:tcW w:w="1000" w:type="dxa"/>
+            <w:tcW w:w="1120" w:type="dxa"/>
             <w:shd w:val="clear" w:color="auto" w:fill="FFFFFF"/>
             <w:tcMar>
               <w:top w:w="80" w:type="dxa"/>
@@ -17454,7 +17521,7 @@
         </w:tc>
         <w:tc>
           <w:tcPr>
-            <w:tcW w:w="3000" w:type="dxa"/>
+            <w:tcW w:w="3359" w:type="dxa"/>
             <w:shd w:val="clear" w:color="auto" w:fill="FFFFFF"/>
             <w:tcMar>
               <w:top w:w="80" w:type="dxa"/>
@@ -17483,7 +17550,7 @@
         </w:tc>
         <w:tc>
           <w:tcPr>
-            <w:tcW w:w="2360" w:type="dxa"/>
+            <w:tcW w:w="2642" w:type="dxa"/>
             <w:shd w:val="clear" w:color="auto" w:fill="FFFFFF"/>
             <w:tcMar>
               <w:top w:w="80" w:type="dxa"/>
@@ -17512,7 +17579,7 @@
         </w:tc>
         <w:tc>
           <w:tcPr>
-            <w:tcW w:w="1000" w:type="dxa"/>
+            <w:tcW w:w="1120" w:type="dxa"/>
             <w:shd w:val="clear" w:color="auto" w:fill="FFFFFF"/>
             <w:tcMar>
               <w:top w:w="80" w:type="dxa"/>
@@ -17544,7 +17611,7 @@
       <w:tr>
         <w:tc>
           <w:tcPr>
-            <w:tcW w:w="1000" w:type="dxa"/>
+            <w:tcW w:w="1119" w:type="dxa"/>
             <w:shd w:val="clear" w:color="auto" w:fill="F2F2F2"/>
             <w:tcMar>
               <w:top w:w="80" w:type="dxa"/>
@@ -17576,7 +17643,7 @@
         </w:tc>
         <w:tc>
           <w:tcPr>
-            <w:tcW w:w="1000" w:type="dxa"/>
+            <w:tcW w:w="1120" w:type="dxa"/>
             <w:shd w:val="clear" w:color="auto" w:fill="F2F2F2"/>
             <w:tcMar>
               <w:top w:w="80" w:type="dxa"/>
@@ -17606,7 +17673,7 @@
         </w:tc>
         <w:tc>
           <w:tcPr>
-            <w:tcW w:w="3000" w:type="dxa"/>
+            <w:tcW w:w="3359" w:type="dxa"/>
             <w:shd w:val="clear" w:color="auto" w:fill="F2F2F2"/>
             <w:tcMar>
               <w:top w:w="80" w:type="dxa"/>
@@ -17635,7 +17702,7 @@
         </w:tc>
         <w:tc>
           <w:tcPr>
-            <w:tcW w:w="2360" w:type="dxa"/>
+            <w:tcW w:w="2642" w:type="dxa"/>
             <w:shd w:val="clear" w:color="auto" w:fill="F2F2F2"/>
             <w:tcMar>
               <w:top w:w="80" w:type="dxa"/>
@@ -17664,7 +17731,7 @@
         </w:tc>
         <w:tc>
           <w:tcPr>
-            <w:tcW w:w="1000" w:type="dxa"/>
+            <w:tcW w:w="1120" w:type="dxa"/>
             <w:shd w:val="clear" w:color="auto" w:fill="F2F2F2"/>
             <w:tcMar>
               <w:top w:w="80" w:type="dxa"/>
@@ -17696,7 +17763,7 @@
       <w:tr>
         <w:tc>
           <w:tcPr>
-            <w:tcW w:w="1000" w:type="dxa"/>
+            <w:tcW w:w="1119" w:type="dxa"/>
             <w:shd w:val="clear" w:color="auto" w:fill="FFFFFF"/>
             <w:tcMar>
               <w:top w:w="80" w:type="dxa"/>
@@ -17728,7 +17795,7 @@
         </w:tc>
         <w:tc>
           <w:tcPr>
-            <w:tcW w:w="1000" w:type="dxa"/>
+            <w:tcW w:w="1120" w:type="dxa"/>
             <w:shd w:val="clear" w:color="auto" w:fill="FFFFFF"/>
             <w:tcMar>
               <w:top w:w="80" w:type="dxa"/>
@@ -17758,7 +17825,7 @@
         </w:tc>
         <w:tc>
           <w:tcPr>
-            <w:tcW w:w="3000" w:type="dxa"/>
+            <w:tcW w:w="3359" w:type="dxa"/>
             <w:shd w:val="clear" w:color="auto" w:fill="FFFFFF"/>
             <w:tcMar>
               <w:top w:w="80" w:type="dxa"/>
@@ -17787,7 +17854,7 @@
         </w:tc>
         <w:tc>
           <w:tcPr>
-            <w:tcW w:w="2360" w:type="dxa"/>
+            <w:tcW w:w="2642" w:type="dxa"/>
             <w:shd w:val="clear" w:color="auto" w:fill="FFFFFF"/>
             <w:tcMar>
               <w:top w:w="80" w:type="dxa"/>
@@ -17816,7 +17883,7 @@
         </w:tc>
         <w:tc>
           <w:tcPr>
-            <w:tcW w:w="1000" w:type="dxa"/>
+            <w:tcW w:w="1120" w:type="dxa"/>
             <w:shd w:val="clear" w:color="auto" w:fill="FFFFFF"/>
             <w:tcMar>
               <w:top w:w="80" w:type="dxa"/>
@@ -17848,7 +17915,7 @@
       <w:tr>
         <w:tc>
           <w:tcPr>
-            <w:tcW w:w="1000" w:type="dxa"/>
+            <w:tcW w:w="1119" w:type="dxa"/>
             <w:shd w:val="clear" w:color="auto" w:fill="F2F2F2"/>
             <w:tcMar>
               <w:top w:w="80" w:type="dxa"/>
@@ -17880,7 +17947,7 @@
         </w:tc>
         <w:tc>
           <w:tcPr>
-            <w:tcW w:w="1000" w:type="dxa"/>
+            <w:tcW w:w="1120" w:type="dxa"/>
             <w:shd w:val="clear" w:color="auto" w:fill="F2F2F2"/>
             <w:tcMar>
               <w:top w:w="80" w:type="dxa"/>
@@ -17910,7 +17977,7 @@
         </w:tc>
         <w:tc>
           <w:tcPr>
-            <w:tcW w:w="3000" w:type="dxa"/>
+            <w:tcW w:w="3359" w:type="dxa"/>
             <w:shd w:val="clear" w:color="auto" w:fill="F2F2F2"/>
             <w:tcMar>
               <w:top w:w="80" w:type="dxa"/>
@@ -17939,7 +18006,7 @@
         </w:tc>
         <w:tc>
           <w:tcPr>
-            <w:tcW w:w="2360" w:type="dxa"/>
+            <w:tcW w:w="2642" w:type="dxa"/>
             <w:shd w:val="clear" w:color="auto" w:fill="F2F2F2"/>
             <w:tcMar>
               <w:top w:w="80" w:type="dxa"/>
@@ -17968,7 +18035,7 @@
         </w:tc>
         <w:tc>
           <w:tcPr>
-            <w:tcW w:w="1000" w:type="dxa"/>
+            <w:tcW w:w="1120" w:type="dxa"/>
             <w:shd w:val="clear" w:color="auto" w:fill="F2F2F2"/>
             <w:tcMar>
               <w:top w:w="80" w:type="dxa"/>
@@ -18000,7 +18067,7 @@
       <w:tr>
         <w:tc>
           <w:tcPr>
-            <w:tcW w:w="1000" w:type="dxa"/>
+            <w:tcW w:w="1119" w:type="dxa"/>
             <w:shd w:val="clear" w:color="auto" w:fill="FFFFFF"/>
             <w:tcMar>
               <w:top w:w="80" w:type="dxa"/>
@@ -18032,7 +18099,7 @@
         </w:tc>
         <w:tc>
           <w:tcPr>
-            <w:tcW w:w="1000" w:type="dxa"/>
+            <w:tcW w:w="1120" w:type="dxa"/>
             <w:shd w:val="clear" w:color="auto" w:fill="FFFFFF"/>
             <w:tcMar>
               <w:top w:w="80" w:type="dxa"/>
@@ -18062,7 +18129,7 @@
         </w:tc>
         <w:tc>
           <w:tcPr>
-            <w:tcW w:w="3000" w:type="dxa"/>
+            <w:tcW w:w="3359" w:type="dxa"/>
             <w:shd w:val="clear" w:color="auto" w:fill="FFFFFF"/>
             <w:tcMar>
               <w:top w:w="80" w:type="dxa"/>
@@ -18091,7 +18158,7 @@
         </w:tc>
         <w:tc>
           <w:tcPr>
-            <w:tcW w:w="2360" w:type="dxa"/>
+            <w:tcW w:w="2642" w:type="dxa"/>
             <w:shd w:val="clear" w:color="auto" w:fill="FFFFFF"/>
             <w:tcMar>
               <w:top w:w="80" w:type="dxa"/>
@@ -18120,7 +18187,7 @@
         </w:tc>
         <w:tc>
           <w:tcPr>
-            <w:tcW w:w="1000" w:type="dxa"/>
+            <w:tcW w:w="1120" w:type="dxa"/>
             <w:shd w:val="clear" w:color="auto" w:fill="FFFFFF"/>
             <w:tcMar>
               <w:top w:w="80" w:type="dxa"/>
@@ -18152,7 +18219,7 @@
       <w:tr>
         <w:tc>
           <w:tcPr>
-            <w:tcW w:w="1000" w:type="dxa"/>
+            <w:tcW w:w="1119" w:type="dxa"/>
             <w:shd w:val="clear" w:color="auto" w:fill="F2F2F2"/>
             <w:tcMar>
               <w:top w:w="80" w:type="dxa"/>
@@ -18184,7 +18251,7 @@
         </w:tc>
         <w:tc>
           <w:tcPr>
-            <w:tcW w:w="1000" w:type="dxa"/>
+            <w:tcW w:w="1120" w:type="dxa"/>
             <w:shd w:val="clear" w:color="auto" w:fill="F2F2F2"/>
             <w:tcMar>
               <w:top w:w="80" w:type="dxa"/>
@@ -18214,7 +18281,7 @@
         </w:tc>
         <w:tc>
           <w:tcPr>
-            <w:tcW w:w="3000" w:type="dxa"/>
+            <w:tcW w:w="3359" w:type="dxa"/>
             <w:shd w:val="clear" w:color="auto" w:fill="F2F2F2"/>
             <w:tcMar>
               <w:top w:w="80" w:type="dxa"/>
@@ -18243,7 +18310,7 @@
         </w:tc>
         <w:tc>
           <w:tcPr>
-            <w:tcW w:w="2360" w:type="dxa"/>
+            <w:tcW w:w="2642" w:type="dxa"/>
             <w:shd w:val="clear" w:color="auto" w:fill="F2F2F2"/>
             <w:tcMar>
               <w:top w:w="80" w:type="dxa"/>
@@ -18272,7 +18339,7 @@
         </w:tc>
         <w:tc>
           <w:tcPr>
-            <w:tcW w:w="1000" w:type="dxa"/>
+            <w:tcW w:w="1120" w:type="dxa"/>
             <w:shd w:val="clear" w:color="auto" w:fill="F2F2F2"/>
             <w:tcMar>
               <w:top w:w="80" w:type="dxa"/>
@@ -18304,7 +18371,7 @@
       <w:tr>
         <w:tc>
           <w:tcPr>
-            <w:tcW w:w="1000" w:type="dxa"/>
+            <w:tcW w:w="1119" w:type="dxa"/>
             <w:shd w:val="clear" w:color="auto" w:fill="FFFFFF"/>
             <w:tcMar>
               <w:top w:w="80" w:type="dxa"/>
@@ -18336,7 +18403,7 @@
         </w:tc>
         <w:tc>
           <w:tcPr>
-            <w:tcW w:w="1000" w:type="dxa"/>
+            <w:tcW w:w="1120" w:type="dxa"/>
             <w:shd w:val="clear" w:color="auto" w:fill="FFFFFF"/>
             <w:tcMar>
               <w:top w:w="80" w:type="dxa"/>
@@ -18366,7 +18433,7 @@
         </w:tc>
         <w:tc>
           <w:tcPr>
-            <w:tcW w:w="3000" w:type="dxa"/>
+            <w:tcW w:w="3359" w:type="dxa"/>
             <w:shd w:val="clear" w:color="auto" w:fill="FFFFFF"/>
             <w:tcMar>
               <w:top w:w="80" w:type="dxa"/>
@@ -18395,7 +18462,7 @@
         </w:tc>
         <w:tc>
           <w:tcPr>
-            <w:tcW w:w="2360" w:type="dxa"/>
+            <w:tcW w:w="2642" w:type="dxa"/>
             <w:shd w:val="clear" w:color="auto" w:fill="FFFFFF"/>
             <w:tcMar>
               <w:top w:w="80" w:type="dxa"/>
@@ -18424,7 +18491,7 @@
         </w:tc>
         <w:tc>
           <w:tcPr>
-            <w:tcW w:w="1000" w:type="dxa"/>
+            <w:tcW w:w="1120" w:type="dxa"/>
             <w:shd w:val="clear" w:color="auto" w:fill="FFFFFF"/>
             <w:tcMar>
               <w:top w:w="80" w:type="dxa"/>
@@ -18456,7 +18523,7 @@
       <w:tr>
         <w:tc>
           <w:tcPr>
-            <w:tcW w:w="1000" w:type="dxa"/>
+            <w:tcW w:w="1119" w:type="dxa"/>
             <w:shd w:val="clear" w:color="auto" w:fill="F2F2F2"/>
             <w:tcMar>
               <w:top w:w="80" w:type="dxa"/>
@@ -18488,7 +18555,7 @@
         </w:tc>
         <w:tc>
           <w:tcPr>
-            <w:tcW w:w="1000" w:type="dxa"/>
+            <w:tcW w:w="1120" w:type="dxa"/>
             <w:shd w:val="clear" w:color="auto" w:fill="F2F2F2"/>
             <w:tcMar>
               <w:top w:w="80" w:type="dxa"/>
@@ -18518,7 +18585,7 @@
         </w:tc>
         <w:tc>
           <w:tcPr>
-            <w:tcW w:w="3000" w:type="dxa"/>
+            <w:tcW w:w="3359" w:type="dxa"/>
             <w:shd w:val="clear" w:color="auto" w:fill="F2F2F2"/>
             <w:tcMar>
               <w:top w:w="80" w:type="dxa"/>
@@ -18547,7 +18614,7 @@
         </w:tc>
         <w:tc>
           <w:tcPr>
-            <w:tcW w:w="2360" w:type="dxa"/>
+            <w:tcW w:w="2642" w:type="dxa"/>
             <w:shd w:val="clear" w:color="auto" w:fill="F2F2F2"/>
             <w:tcMar>
               <w:top w:w="80" w:type="dxa"/>
@@ -18576,7 +18643,7 @@
         </w:tc>
         <w:tc>
           <w:tcPr>
-            <w:tcW w:w="1000" w:type="dxa"/>
+            <w:tcW w:w="1120" w:type="dxa"/>
             <w:shd w:val="clear" w:color="auto" w:fill="F2F2F2"/>
             <w:tcMar>
               <w:top w:w="80" w:type="dxa"/>
@@ -18608,7 +18675,7 @@
       <w:tr>
         <w:tc>
           <w:tcPr>
-            <w:tcW w:w="1000" w:type="dxa"/>
+            <w:tcW w:w="1119" w:type="dxa"/>
             <w:shd w:val="clear" w:color="auto" w:fill="FFFFFF"/>
             <w:tcMar>
               <w:top w:w="80" w:type="dxa"/>
@@ -18640,7 +18707,7 @@
         </w:tc>
         <w:tc>
           <w:tcPr>
-            <w:tcW w:w="1000" w:type="dxa"/>
+            <w:tcW w:w="1120" w:type="dxa"/>
             <w:shd w:val="clear" w:color="auto" w:fill="FFFFFF"/>
             <w:tcMar>
               <w:top w:w="80" w:type="dxa"/>
@@ -18670,7 +18737,7 @@
         </w:tc>
         <w:tc>
           <w:tcPr>
-            <w:tcW w:w="3000" w:type="dxa"/>
+            <w:tcW w:w="3359" w:type="dxa"/>
             <w:shd w:val="clear" w:color="auto" w:fill="FFFFFF"/>
             <w:tcMar>
               <w:top w:w="80" w:type="dxa"/>
@@ -18710,7 +18777,7 @@
         </w:tc>
         <w:tc>
           <w:tcPr>
-            <w:tcW w:w="2360" w:type="dxa"/>
+            <w:tcW w:w="2642" w:type="dxa"/>
             <w:shd w:val="clear" w:color="auto" w:fill="FFFFFF"/>
             <w:tcMar>
               <w:top w:w="80" w:type="dxa"/>
@@ -18739,7 +18806,7 @@
         </w:tc>
         <w:tc>
           <w:tcPr>
-            <w:tcW w:w="1000" w:type="dxa"/>
+            <w:tcW w:w="1120" w:type="dxa"/>
             <w:shd w:val="clear" w:color="auto" w:fill="FFFFFF"/>
             <w:tcMar>
               <w:top w:w="80" w:type="dxa"/>
@@ -18771,7 +18838,7 @@
       <w:tr>
         <w:tc>
           <w:tcPr>
-            <w:tcW w:w="1000" w:type="dxa"/>
+            <w:tcW w:w="1119" w:type="dxa"/>
             <w:shd w:val="clear" w:color="auto" w:fill="F2F2F2"/>
             <w:tcMar>
               <w:top w:w="80" w:type="dxa"/>
@@ -18803,7 +18870,7 @@
         </w:tc>
         <w:tc>
           <w:tcPr>
-            <w:tcW w:w="1000" w:type="dxa"/>
+            <w:tcW w:w="1120" w:type="dxa"/>
             <w:shd w:val="clear" w:color="auto" w:fill="F2F2F2"/>
             <w:tcMar>
               <w:top w:w="80" w:type="dxa"/>
@@ -18833,7 +18900,7 @@
         </w:tc>
         <w:tc>
           <w:tcPr>
-            <w:tcW w:w="3000" w:type="dxa"/>
+            <w:tcW w:w="3359" w:type="dxa"/>
             <w:shd w:val="clear" w:color="auto" w:fill="F2F2F2"/>
             <w:tcMar>
               <w:top w:w="80" w:type="dxa"/>
@@ -18873,7 +18940,7 @@
         </w:tc>
         <w:tc>
           <w:tcPr>
-            <w:tcW w:w="2360" w:type="dxa"/>
+            <w:tcW w:w="2642" w:type="dxa"/>
             <w:shd w:val="clear" w:color="auto" w:fill="F2F2F2"/>
             <w:tcMar>
               <w:top w:w="80" w:type="dxa"/>
@@ -18913,7 +18980,7 @@
         </w:tc>
         <w:tc>
           <w:tcPr>
-            <w:tcW w:w="1000" w:type="dxa"/>
+            <w:tcW w:w="1120" w:type="dxa"/>
             <w:shd w:val="clear" w:color="auto" w:fill="F2F2F2"/>
             <w:tcMar>
               <w:top w:w="80" w:type="dxa"/>
@@ -18945,7 +19012,7 @@
       <w:tr>
         <w:tc>
           <w:tcPr>
-            <w:tcW w:w="1000" w:type="dxa"/>
+            <w:tcW w:w="1119" w:type="dxa"/>
             <w:shd w:val="clear" w:color="auto" w:fill="FFFFFF"/>
             <w:tcMar>
               <w:top w:w="80" w:type="dxa"/>
@@ -18977,7 +19044,7 @@
         </w:tc>
         <w:tc>
           <w:tcPr>
-            <w:tcW w:w="1000" w:type="dxa"/>
+            <w:tcW w:w="1120" w:type="dxa"/>
             <w:shd w:val="clear" w:color="auto" w:fill="FFFFFF"/>
             <w:tcMar>
               <w:top w:w="80" w:type="dxa"/>
@@ -19007,7 +19074,7 @@
         </w:tc>
         <w:tc>
           <w:tcPr>
-            <w:tcW w:w="3000" w:type="dxa"/>
+            <w:tcW w:w="3359" w:type="dxa"/>
             <w:shd w:val="clear" w:color="auto" w:fill="FFFFFF"/>
             <w:tcMar>
               <w:top w:w="80" w:type="dxa"/>
@@ -19047,7 +19114,7 @@
         </w:tc>
         <w:tc>
           <w:tcPr>
-            <w:tcW w:w="2360" w:type="dxa"/>
+            <w:tcW w:w="2642" w:type="dxa"/>
             <w:shd w:val="clear" w:color="auto" w:fill="FFFFFF"/>
             <w:tcMar>
               <w:top w:w="80" w:type="dxa"/>
@@ -19076,7 +19143,7 @@
         </w:tc>
         <w:tc>
           <w:tcPr>
-            <w:tcW w:w="1000" w:type="dxa"/>
+            <w:tcW w:w="1120" w:type="dxa"/>
             <w:shd w:val="clear" w:color="auto" w:fill="FFFFFF"/>
             <w:tcMar>
               <w:top w:w="80" w:type="dxa"/>
@@ -19108,7 +19175,7 @@
       <w:tr>
         <w:tc>
           <w:tcPr>
-            <w:tcW w:w="1000" w:type="dxa"/>
+            <w:tcW w:w="1119" w:type="dxa"/>
             <w:shd w:val="clear" w:color="auto" w:fill="F2F2F2"/>
             <w:tcMar>
               <w:top w:w="80" w:type="dxa"/>
@@ -19140,7 +19207,7 @@
         </w:tc>
         <w:tc>
           <w:tcPr>
-            <w:tcW w:w="1000" w:type="dxa"/>
+            <w:tcW w:w="1120" w:type="dxa"/>
             <w:shd w:val="clear" w:color="auto" w:fill="F2F2F2"/>
             <w:tcMar>
               <w:top w:w="80" w:type="dxa"/>
@@ -19170,7 +19237,7 @@
         </w:tc>
         <w:tc>
           <w:tcPr>
-            <w:tcW w:w="3000" w:type="dxa"/>
+            <w:tcW w:w="3359" w:type="dxa"/>
             <w:shd w:val="clear" w:color="auto" w:fill="F2F2F2"/>
             <w:tcMar>
               <w:top w:w="80" w:type="dxa"/>
@@ -19199,7 +19266,7 @@
         </w:tc>
         <w:tc>
           <w:tcPr>
-            <w:tcW w:w="2360" w:type="dxa"/>
+            <w:tcW w:w="2642" w:type="dxa"/>
             <w:shd w:val="clear" w:color="auto" w:fill="F2F2F2"/>
             <w:tcMar>
               <w:top w:w="80" w:type="dxa"/>
@@ -19228,7 +19295,7 @@
         </w:tc>
         <w:tc>
           <w:tcPr>
-            <w:tcW w:w="1000" w:type="dxa"/>
+            <w:tcW w:w="1120" w:type="dxa"/>
             <w:shd w:val="clear" w:color="auto" w:fill="F2F2F2"/>
             <w:tcMar>
               <w:top w:w="80" w:type="dxa"/>
@@ -19260,7 +19327,7 @@
       <w:tr>
         <w:tc>
           <w:tcPr>
-            <w:tcW w:w="1000" w:type="dxa"/>
+            <w:tcW w:w="1119" w:type="dxa"/>
             <w:shd w:val="clear" w:color="auto" w:fill="FFFFFF"/>
             <w:tcMar>
               <w:top w:w="80" w:type="dxa"/>
@@ -19292,7 +19359,7 @@
         </w:tc>
         <w:tc>
           <w:tcPr>
-            <w:tcW w:w="1000" w:type="dxa"/>
+            <w:tcW w:w="1120" w:type="dxa"/>
             <w:shd w:val="clear" w:color="auto" w:fill="FFFFFF"/>
             <w:tcMar>
               <w:top w:w="80" w:type="dxa"/>
@@ -19322,7 +19389,7 @@
         </w:tc>
         <w:tc>
           <w:tcPr>
-            <w:tcW w:w="3000" w:type="dxa"/>
+            <w:tcW w:w="3359" w:type="dxa"/>
             <w:shd w:val="clear" w:color="auto" w:fill="FFFFFF"/>
             <w:tcMar>
               <w:top w:w="80" w:type="dxa"/>
@@ -19351,7 +19418,7 @@
         </w:tc>
         <w:tc>
           <w:tcPr>
-            <w:tcW w:w="2360" w:type="dxa"/>
+            <w:tcW w:w="2642" w:type="dxa"/>
             <w:shd w:val="clear" w:color="auto" w:fill="FFFFFF"/>
             <w:tcMar>
               <w:top w:w="80" w:type="dxa"/>
@@ -19380,7 +19447,7 @@
         </w:tc>
         <w:tc>
           <w:tcPr>
-            <w:tcW w:w="1000" w:type="dxa"/>
+            <w:tcW w:w="1120" w:type="dxa"/>
             <w:shd w:val="clear" w:color="auto" w:fill="FFFFFF"/>
             <w:tcMar>
               <w:top w:w="80" w:type="dxa"/>
@@ -19412,7 +19479,7 @@
       <w:tr>
         <w:tc>
           <w:tcPr>
-            <w:tcW w:w="1000" w:type="dxa"/>
+            <w:tcW w:w="1119" w:type="dxa"/>
             <w:shd w:val="clear" w:color="auto" w:fill="F2F2F2"/>
             <w:tcMar>
               <w:top w:w="80" w:type="dxa"/>
@@ -19444,7 +19511,7 @@
         </w:tc>
         <w:tc>
           <w:tcPr>
-            <w:tcW w:w="1000" w:type="dxa"/>
+            <w:tcW w:w="1120" w:type="dxa"/>
             <w:shd w:val="clear" w:color="auto" w:fill="F2F2F2"/>
             <w:tcMar>
               <w:top w:w="80" w:type="dxa"/>
@@ -19474,7 +19541,7 @@
         </w:tc>
         <w:tc>
           <w:tcPr>
-            <w:tcW w:w="3000" w:type="dxa"/>
+            <w:tcW w:w="3359" w:type="dxa"/>
             <w:shd w:val="clear" w:color="auto" w:fill="F2F2F2"/>
             <w:tcMar>
               <w:top w:w="80" w:type="dxa"/>
@@ -19503,7 +19570,7 @@
         </w:tc>
         <w:tc>
           <w:tcPr>
-            <w:tcW w:w="2360" w:type="dxa"/>
+            <w:tcW w:w="2642" w:type="dxa"/>
             <w:shd w:val="clear" w:color="auto" w:fill="F2F2F2"/>
             <w:tcMar>
               <w:top w:w="80" w:type="dxa"/>
@@ -19532,7 +19599,7 @@
         </w:tc>
         <w:tc>
           <w:tcPr>
-            <w:tcW w:w="1000" w:type="dxa"/>
+            <w:tcW w:w="1120" w:type="dxa"/>
             <w:shd w:val="clear" w:color="auto" w:fill="F2F2F2"/>
             <w:tcMar>
               <w:top w:w="80" w:type="dxa"/>
@@ -19564,7 +19631,7 @@
       <w:tr>
         <w:tc>
           <w:tcPr>
-            <w:tcW w:w="1000" w:type="dxa"/>
+            <w:tcW w:w="1119" w:type="dxa"/>
             <w:shd w:val="clear" w:color="auto" w:fill="FFFFFF"/>
             <w:tcMar>
               <w:top w:w="80" w:type="dxa"/>
@@ -19596,7 +19663,7 @@
         </w:tc>
         <w:tc>
           <w:tcPr>
-            <w:tcW w:w="1000" w:type="dxa"/>
+            <w:tcW w:w="1120" w:type="dxa"/>
             <w:shd w:val="clear" w:color="auto" w:fill="FFFFFF"/>
             <w:tcMar>
               <w:top w:w="80" w:type="dxa"/>
@@ -19626,7 +19693,7 @@
         </w:tc>
         <w:tc>
           <w:tcPr>
-            <w:tcW w:w="3000" w:type="dxa"/>
+            <w:tcW w:w="3359" w:type="dxa"/>
             <w:shd w:val="clear" w:color="auto" w:fill="FFFFFF"/>
             <w:tcMar>
               <w:top w:w="80" w:type="dxa"/>
@@ -19655,7 +19722,7 @@
         </w:tc>
         <w:tc>
           <w:tcPr>
-            <w:tcW w:w="2360" w:type="dxa"/>
+            <w:tcW w:w="2642" w:type="dxa"/>
             <w:shd w:val="clear" w:color="auto" w:fill="FFFFFF"/>
             <w:tcMar>
               <w:top w:w="80" w:type="dxa"/>
@@ -19684,7 +19751,7 @@
         </w:tc>
         <w:tc>
           <w:tcPr>
-            <w:tcW w:w="1000" w:type="dxa"/>
+            <w:tcW w:w="1120" w:type="dxa"/>
             <w:shd w:val="clear" w:color="auto" w:fill="FFFFFF"/>
             <w:tcMar>
               <w:top w:w="80" w:type="dxa"/>
@@ -19716,7 +19783,7 @@
       <w:tr>
         <w:tc>
           <w:tcPr>
-            <w:tcW w:w="1000" w:type="dxa"/>
+            <w:tcW w:w="1119" w:type="dxa"/>
             <w:shd w:val="clear" w:color="auto" w:fill="F2F2F2"/>
             <w:tcMar>
               <w:top w:w="80" w:type="dxa"/>
@@ -19748,7 +19815,7 @@
         </w:tc>
         <w:tc>
           <w:tcPr>
-            <w:tcW w:w="1000" w:type="dxa"/>
+            <w:tcW w:w="1120" w:type="dxa"/>
             <w:shd w:val="clear" w:color="auto" w:fill="F2F2F2"/>
             <w:tcMar>
               <w:top w:w="80" w:type="dxa"/>
@@ -19778,7 +19845,7 @@
         </w:tc>
         <w:tc>
           <w:tcPr>
-            <w:tcW w:w="3000" w:type="dxa"/>
+            <w:tcW w:w="3359" w:type="dxa"/>
             <w:shd w:val="clear" w:color="auto" w:fill="F2F2F2"/>
             <w:tcMar>
               <w:top w:w="80" w:type="dxa"/>
@@ -19807,7 +19874,7 @@
         </w:tc>
         <w:tc>
           <w:tcPr>
-            <w:tcW w:w="2360" w:type="dxa"/>
+            <w:tcW w:w="2642" w:type="dxa"/>
             <w:shd w:val="clear" w:color="auto" w:fill="F2F2F2"/>
             <w:tcMar>
               <w:top w:w="80" w:type="dxa"/>
@@ -19836,7 +19903,7 @@
         </w:tc>
         <w:tc>
           <w:tcPr>
-            <w:tcW w:w="1000" w:type="dxa"/>
+            <w:tcW w:w="1120" w:type="dxa"/>
             <w:shd w:val="clear" w:color="auto" w:fill="F2F2F2"/>
             <w:tcMar>
               <w:top w:w="80" w:type="dxa"/>
@@ -19868,7 +19935,7 @@
       <w:tr>
         <w:tc>
           <w:tcPr>
-            <w:tcW w:w="1000" w:type="dxa"/>
+            <w:tcW w:w="1119" w:type="dxa"/>
             <w:shd w:val="clear" w:color="auto" w:fill="FFFFFF"/>
             <w:tcMar>
               <w:top w:w="80" w:type="dxa"/>
@@ -19900,7 +19967,7 @@
         </w:tc>
         <w:tc>
           <w:tcPr>
-            <w:tcW w:w="1000" w:type="dxa"/>
+            <w:tcW w:w="1120" w:type="dxa"/>
             <w:shd w:val="clear" w:color="auto" w:fill="FFFFFF"/>
             <w:tcMar>
               <w:top w:w="80" w:type="dxa"/>
@@ -19930,7 +19997,7 @@
         </w:tc>
         <w:tc>
           <w:tcPr>
-            <w:tcW w:w="3000" w:type="dxa"/>
+            <w:tcW w:w="3359" w:type="dxa"/>
             <w:shd w:val="clear" w:color="auto" w:fill="FFFFFF"/>
             <w:tcMar>
               <w:top w:w="80" w:type="dxa"/>
@@ -19959,7 +20026,7 @@
         </w:tc>
         <w:tc>
           <w:tcPr>
-            <w:tcW w:w="2360" w:type="dxa"/>
+            <w:tcW w:w="2642" w:type="dxa"/>
             <w:shd w:val="clear" w:color="auto" w:fill="FFFFFF"/>
             <w:tcMar>
               <w:top w:w="80" w:type="dxa"/>
@@ -19988,7 +20055,7 @@
         </w:tc>
         <w:tc>
           <w:tcPr>
-            <w:tcW w:w="1000" w:type="dxa"/>
+            <w:tcW w:w="1120" w:type="dxa"/>
             <w:shd w:val="clear" w:color="auto" w:fill="FFFFFF"/>
             <w:tcMar>
               <w:top w:w="80" w:type="dxa"/>
@@ -20020,7 +20087,7 @@
       <w:tr>
         <w:tc>
           <w:tcPr>
-            <w:tcW w:w="1000" w:type="dxa"/>
+            <w:tcW w:w="1119" w:type="dxa"/>
             <w:shd w:val="clear" w:color="auto" w:fill="F2F2F2"/>
             <w:tcMar>
               <w:top w:w="80" w:type="dxa"/>
@@ -20052,7 +20119,7 @@
         </w:tc>
         <w:tc>
           <w:tcPr>
-            <w:tcW w:w="1000" w:type="dxa"/>
+            <w:tcW w:w="1120" w:type="dxa"/>
             <w:shd w:val="clear" w:color="auto" w:fill="F2F2F2"/>
             <w:tcMar>
               <w:top w:w="80" w:type="dxa"/>
@@ -20082,7 +20149,7 @@
         </w:tc>
         <w:tc>
           <w:tcPr>
-            <w:tcW w:w="3000" w:type="dxa"/>
+            <w:tcW w:w="3359" w:type="dxa"/>
             <w:shd w:val="clear" w:color="auto" w:fill="F2F2F2"/>
             <w:tcMar>
               <w:top w:w="80" w:type="dxa"/>
@@ -20111,7 +20178,7 @@
         </w:tc>
         <w:tc>
           <w:tcPr>
-            <w:tcW w:w="2360" w:type="dxa"/>
+            <w:tcW w:w="2642" w:type="dxa"/>
             <w:shd w:val="clear" w:color="auto" w:fill="F2F2F2"/>
             <w:tcMar>
               <w:top w:w="80" w:type="dxa"/>
@@ -20140,7 +20207,7 @@
         </w:tc>
         <w:tc>
           <w:tcPr>
-            <w:tcW w:w="1000" w:type="dxa"/>
+            <w:tcW w:w="1120" w:type="dxa"/>
             <w:shd w:val="clear" w:color="auto" w:fill="F2F2F2"/>
             <w:tcMar>
               <w:top w:w="80" w:type="dxa"/>
@@ -20172,7 +20239,7 @@
       <w:tr>
         <w:tc>
           <w:tcPr>
-            <w:tcW w:w="1000" w:type="dxa"/>
+            <w:tcW w:w="1119" w:type="dxa"/>
             <w:shd w:val="clear" w:color="auto" w:fill="FFFFFF"/>
             <w:tcMar>
               <w:top w:w="80" w:type="dxa"/>
@@ -20204,7 +20271,7 @@
         </w:tc>
         <w:tc>
           <w:tcPr>
-            <w:tcW w:w="1000" w:type="dxa"/>
+            <w:tcW w:w="1120" w:type="dxa"/>
             <w:shd w:val="clear" w:color="auto" w:fill="FFFFFF"/>
             <w:tcMar>
               <w:top w:w="80" w:type="dxa"/>
@@ -20234,7 +20301,7 @@
         </w:tc>
         <w:tc>
           <w:tcPr>
-            <w:tcW w:w="3000" w:type="dxa"/>
+            <w:tcW w:w="3359" w:type="dxa"/>
             <w:shd w:val="clear" w:color="auto" w:fill="FFFFFF"/>
             <w:tcMar>
               <w:top w:w="80" w:type="dxa"/>
@@ -20263,7 +20330,7 @@
         </w:tc>
         <w:tc>
           <w:tcPr>
-            <w:tcW w:w="2360" w:type="dxa"/>
+            <w:tcW w:w="2642" w:type="dxa"/>
             <w:shd w:val="clear" w:color="auto" w:fill="FFFFFF"/>
             <w:tcMar>
               <w:top w:w="80" w:type="dxa"/>
@@ -20292,7 +20359,7 @@
         </w:tc>
         <w:tc>
           <w:tcPr>
-            <w:tcW w:w="1000" w:type="dxa"/>
+            <w:tcW w:w="1120" w:type="dxa"/>
             <w:shd w:val="clear" w:color="auto" w:fill="FFFFFF"/>
             <w:tcMar>
               <w:top w:w="80" w:type="dxa"/>
@@ -20324,7 +20391,7 @@
       <w:tr>
         <w:tc>
           <w:tcPr>
-            <w:tcW w:w="1000" w:type="dxa"/>
+            <w:tcW w:w="1119" w:type="dxa"/>
             <w:shd w:val="clear" w:color="auto" w:fill="F2F2F2"/>
             <w:tcMar>
               <w:top w:w="80" w:type="dxa"/>
@@ -20356,7 +20423,7 @@
         </w:tc>
         <w:tc>
           <w:tcPr>
-            <w:tcW w:w="1000" w:type="dxa"/>
+            <w:tcW w:w="1120" w:type="dxa"/>
             <w:shd w:val="clear" w:color="auto" w:fill="F2F2F2"/>
             <w:tcMar>
               <w:top w:w="80" w:type="dxa"/>
@@ -20386,7 +20453,7 @@
         </w:tc>
         <w:tc>
           <w:tcPr>
-            <w:tcW w:w="3000" w:type="dxa"/>
+            <w:tcW w:w="3359" w:type="dxa"/>
             <w:shd w:val="clear" w:color="auto" w:fill="F2F2F2"/>
             <w:tcMar>
               <w:top w:w="80" w:type="dxa"/>
@@ -20415,7 +20482,7 @@
         </w:tc>
         <w:tc>
           <w:tcPr>
-            <w:tcW w:w="2360" w:type="dxa"/>
+            <w:tcW w:w="2642" w:type="dxa"/>
             <w:shd w:val="clear" w:color="auto" w:fill="F2F2F2"/>
             <w:tcMar>
               <w:top w:w="80" w:type="dxa"/>
@@ -20444,7 +20511,7 @@
         </w:tc>
         <w:tc>
           <w:tcPr>
-            <w:tcW w:w="1000" w:type="dxa"/>
+            <w:tcW w:w="1120" w:type="dxa"/>
             <w:shd w:val="clear" w:color="auto" w:fill="F2F2F2"/>
             <w:tcMar>
               <w:top w:w="80" w:type="dxa"/>
@@ -20476,7 +20543,7 @@
       <w:tr>
         <w:tc>
           <w:tcPr>
-            <w:tcW w:w="1000" w:type="dxa"/>
+            <w:tcW w:w="1119" w:type="dxa"/>
             <w:shd w:val="clear" w:color="auto" w:fill="FFFFFF"/>
             <w:tcMar>
               <w:top w:w="80" w:type="dxa"/>
@@ -20508,7 +20575,7 @@
         </w:tc>
         <w:tc>
           <w:tcPr>
-            <w:tcW w:w="1000" w:type="dxa"/>
+            <w:tcW w:w="1120" w:type="dxa"/>
             <w:shd w:val="clear" w:color="auto" w:fill="FFFFFF"/>
             <w:tcMar>
               <w:top w:w="80" w:type="dxa"/>
@@ -20538,7 +20605,7 @@
         </w:tc>
         <w:tc>
           <w:tcPr>
-            <w:tcW w:w="3000" w:type="dxa"/>
+            <w:tcW w:w="3359" w:type="dxa"/>
             <w:shd w:val="clear" w:color="auto" w:fill="FFFFFF"/>
             <w:tcMar>
               <w:top w:w="80" w:type="dxa"/>
@@ -20567,7 +20634,7 @@
         </w:tc>
         <w:tc>
           <w:tcPr>
-            <w:tcW w:w="2360" w:type="dxa"/>
+            <w:tcW w:w="2642" w:type="dxa"/>
             <w:shd w:val="clear" w:color="auto" w:fill="FFFFFF"/>
             <w:tcMar>
               <w:top w:w="80" w:type="dxa"/>
@@ -20596,160 +20663,8 @@
         </w:tc>
         <w:tc>
           <w:tcPr>
-            <w:tcW w:w="1000" w:type="dxa"/>
+            <w:tcW w:w="1120" w:type="dxa"/>
             <w:shd w:val="clear" w:color="auto" w:fill="FFFFFF"/>
-            <w:tcMar>
-              <w:top w:w="80" w:type="dxa"/>
-              <w:left w:w="120" w:type="dxa"/>
-              <w:bottom w:w="80" w:type="dxa"/>
-              <w:right w:w="120" w:type="dxa"/>
-            </w:tcMar>
-            <w:vAlign w:val="center"/>
-          </w:tcPr>
-          <w:p>
-            <w:pPr>
-              <w:jc w:val="center"/>
-              <w:rPr>
-                <w:rFonts w:asciiTheme="majorHAnsi" w:hAnsiTheme="majorHAnsi"/>
-              </w:rPr>
-            </w:pPr>
-            <w:r>
-              <w:rPr>
-                <w:rFonts w:asciiTheme="majorHAnsi" w:hAnsiTheme="majorHAnsi"/>
-                <w:color w:val="000000"/>
-                <w:sz w:val="19"/>
-                <w:szCs w:val="19"/>
-              </w:rPr>
-              <w:t>Manual</w:t>
-            </w:r>
-          </w:p>
-        </w:tc>
-      </w:tr>
-      <w:tr>
-        <w:tc>
-          <w:tcPr>
-            <w:tcW w:w="1000" w:type="dxa"/>
-            <w:shd w:val="clear" w:color="auto" w:fill="F2F2F2"/>
-            <w:tcMar>
-              <w:top w:w="80" w:type="dxa"/>
-              <w:left w:w="120" w:type="dxa"/>
-              <w:bottom w:w="80" w:type="dxa"/>
-              <w:right w:w="120" w:type="dxa"/>
-            </w:tcMar>
-            <w:vAlign w:val="center"/>
-          </w:tcPr>
-          <w:p>
-            <w:pPr>
-              <w:jc w:val="center"/>
-              <w:rPr>
-                <w:rFonts w:asciiTheme="majorHAnsi" w:hAnsiTheme="majorHAnsi"/>
-              </w:rPr>
-            </w:pPr>
-            <w:r>
-              <w:rPr>
-                <w:rFonts w:asciiTheme="majorHAnsi" w:hAnsiTheme="majorHAnsi"/>
-                <w:b/>
-                <w:bCs/>
-                <w:color w:val="000000"/>
-                <w:sz w:val="19"/>
-                <w:szCs w:val="19"/>
-              </w:rPr>
-              <w:t>TC-26</w:t>
-            </w:r>
-          </w:p>
-        </w:tc>
-        <w:tc>
-          <w:tcPr>
-            <w:tcW w:w="1000" w:type="dxa"/>
-            <w:shd w:val="clear" w:color="auto" w:fill="F2F2F2"/>
-            <w:tcMar>
-              <w:top w:w="80" w:type="dxa"/>
-              <w:left w:w="120" w:type="dxa"/>
-              <w:bottom w:w="80" w:type="dxa"/>
-              <w:right w:w="120" w:type="dxa"/>
-            </w:tcMar>
-            <w:vAlign w:val="center"/>
-          </w:tcPr>
-          <w:p>
-            <w:pPr>
-              <w:jc w:val="center"/>
-              <w:rPr>
-                <w:rFonts w:asciiTheme="majorHAnsi" w:hAnsiTheme="majorHAnsi"/>
-              </w:rPr>
-            </w:pPr>
-            <w:r>
-              <w:rPr>
-                <w:rFonts w:asciiTheme="majorHAnsi" w:hAnsiTheme="majorHAnsi"/>
-                <w:color w:val="000000"/>
-                <w:sz w:val="19"/>
-                <w:szCs w:val="19"/>
-              </w:rPr>
-              <w:t>FR-22</w:t>
-            </w:r>
-          </w:p>
-        </w:tc>
-        <w:tc>
-          <w:tcPr>
-            <w:tcW w:w="3000" w:type="dxa"/>
-            <w:shd w:val="clear" w:color="auto" w:fill="F2F2F2"/>
-            <w:tcMar>
-              <w:top w:w="80" w:type="dxa"/>
-              <w:left w:w="120" w:type="dxa"/>
-              <w:bottom w:w="80" w:type="dxa"/>
-              <w:right w:w="120" w:type="dxa"/>
-            </w:tcMar>
-            <w:vAlign w:val="center"/>
-          </w:tcPr>
-          <w:p>
-            <w:pPr>
-              <w:rPr>
-                <w:rFonts w:asciiTheme="majorHAnsi" w:hAnsiTheme="majorHAnsi"/>
-              </w:rPr>
-            </w:pPr>
-            <w:r>
-              <w:rPr>
-                <w:rFonts w:asciiTheme="majorHAnsi" w:hAnsiTheme="majorHAnsi"/>
-                <w:color w:val="000000"/>
-                <w:sz w:val="19"/>
-                <w:szCs w:val="19"/>
-              </w:rPr>
-              <w:t>Test earnings report viewing</w:t>
-            </w:r>
-          </w:p>
-        </w:tc>
-        <w:tc>
-          <w:tcPr>
-            <w:tcW w:w="2360" w:type="dxa"/>
-            <w:shd w:val="clear" w:color="auto" w:fill="F2F2F2"/>
-            <w:tcMar>
-              <w:top w:w="80" w:type="dxa"/>
-              <w:left w:w="120" w:type="dxa"/>
-              <w:bottom w:w="80" w:type="dxa"/>
-              <w:right w:w="120" w:type="dxa"/>
-            </w:tcMar>
-            <w:vAlign w:val="center"/>
-          </w:tcPr>
-          <w:p>
-            <w:pPr>
-              <w:rPr>
-                <w:rFonts w:asciiTheme="majorHAnsi" w:hAnsiTheme="majorHAnsi"/>
-              </w:rPr>
-            </w:pPr>
-            <w:r>
-              <w:rPr>
-                <w:rFonts w:asciiTheme="majorHAnsi" w:hAnsiTheme="majorHAnsi"/>
-                <w:color w:val="000000"/>
-                <w:sz w:val="19"/>
-                <w:szCs w:val="19"/>
-              </w:rPr>
-              <w:t>Admin is logged in</w:t>
-            </w:r>
-          </w:p>
-        </w:tc>
-        <w:tc>
-          <w:tcPr>
-            <w:tcW w:w="1000" w:type="dxa"/>
-            <w:shd w:val="clear" w:color="auto" w:fill="F2F2F2"/>
             <w:tcMar>
               <w:top w:w="80" w:type="dxa"/>
               <w:left w:w="120" w:type="dxa"/>
@@ -20827,7 +20742,53 @@
           <w:sz w:val="18"/>
           <w:szCs w:val="18"/>
         </w:rPr>
-        <w:t>Detailed step-by-step execution guide for all 26 test cases.</w:t>
+        <w:t xml:space="preserve">Detailed step-by-step execution guide for all </w:t>
+      </w:r>
+      <w:proofErr w:type="gramStart"/>
+      <w:r>
+        <w:rPr>
+          <w:rFonts w:asciiTheme="majorHAnsi" w:hAnsiTheme="majorHAnsi"/>
+          <w:i/>
+          <w:iCs/>
+          <w:color w:val="555555"/>
+          <w:sz w:val="18"/>
+          <w:szCs w:val="18"/>
+        </w:rPr>
+        <w:t>2</w:t>
+      </w:r>
+      <w:r>
+        <w:rPr>
+          <w:rFonts w:asciiTheme="majorHAnsi" w:hAnsiTheme="majorHAnsi"/>
+          <w:i/>
+          <w:iCs/>
+          <w:color w:val="555555"/>
+          <w:sz w:val="18"/>
+          <w:szCs w:val="18"/>
+        </w:rPr>
+        <w:t xml:space="preserve">5 </w:t>
+      </w:r>
+      <w:r>
+        <w:rPr>
+          <w:rFonts w:asciiTheme="majorHAnsi" w:hAnsiTheme="majorHAnsi"/>
+          <w:i/>
+          <w:iCs/>
+          <w:color w:val="555555"/>
+          <w:sz w:val="18"/>
+          <w:szCs w:val="18"/>
+        </w:rPr>
+        <w:t xml:space="preserve"> test</w:t>
+      </w:r>
+      <w:proofErr w:type="gramEnd"/>
+      <w:r>
+        <w:rPr>
+          <w:rFonts w:asciiTheme="majorHAnsi" w:hAnsiTheme="majorHAnsi"/>
+          <w:i/>
+          <w:iCs/>
+          <w:color w:val="555555"/>
+          <w:sz w:val="18"/>
+          <w:szCs w:val="18"/>
+        </w:rPr>
+        <w:t xml:space="preserve"> cases.</w:t>
       </w:r>
     </w:p>
     <w:p>
@@ -29622,326 +29583,6 @@
         </w:rPr>
       </w:pPr>
     </w:p>
-    <w:tbl>
-      <w:tblPr>
-        <w:tblW w:w="9360" w:type="dxa"/>
-        <w:tblBorders>
-          <w:top w:val="single" w:sz="4" w:space="0" w:color="auto"/>
-          <w:left w:val="single" w:sz="4" w:space="0" w:color="auto"/>
-          <w:bottom w:val="single" w:sz="4" w:space="0" w:color="auto"/>
-          <w:right w:val="single" w:sz="4" w:space="0" w:color="auto"/>
-          <w:insideH w:val="single" w:sz="4" w:space="0" w:color="auto"/>
-          <w:insideV w:val="single" w:sz="4" w:space="0" w:color="auto"/>
-        </w:tblBorders>
-        <w:tblCellMar>
-          <w:left w:w="10" w:type="dxa"/>
-          <w:right w:w="10" w:type="dxa"/>
-        </w:tblCellMar>
-        <w:tblLook w:val="04A0" w:firstRow="1" w:lastRow="0" w:firstColumn="1" w:lastColumn="0" w:noHBand="0" w:noVBand="1"/>
-      </w:tblPr>
-      <w:tblGrid>
-        <w:gridCol w:w="1400"/>
-        <w:gridCol w:w="7960"/>
-      </w:tblGrid>
-      <w:tr>
-        <w:tc>
-          <w:tcPr>
-            <w:tcW w:w="9360" w:type="dxa"/>
-            <w:gridSpan w:val="2"/>
-            <w:shd w:val="clear" w:color="auto" w:fill="000000"/>
-            <w:tcMar>
-              <w:top w:w="80" w:type="dxa"/>
-              <w:left w:w="120" w:type="dxa"/>
-              <w:bottom w:w="80" w:type="dxa"/>
-              <w:right w:w="120" w:type="dxa"/>
-            </w:tcMar>
-          </w:tcPr>
-          <w:p>
-            <w:pPr>
-              <w:rPr>
-                <w:rFonts w:asciiTheme="majorHAnsi" w:hAnsiTheme="majorHAnsi"/>
-              </w:rPr>
-            </w:pPr>
-            <w:r>
-              <w:rPr>
-                <w:rFonts w:asciiTheme="majorHAnsi" w:hAnsiTheme="majorHAnsi"/>
-                <w:b/>
-                <w:bCs/>
-                <w:color w:val="FFFFFF"/>
-              </w:rPr>
-              <w:t>TC-26 — Earnings Report Viewing</w:t>
-            </w:r>
-          </w:p>
-        </w:tc>
-      </w:tr>
-      <w:tr>
-        <w:tc>
-          <w:tcPr>
-            <w:tcW w:w="1400" w:type="dxa"/>
-            <w:shd w:val="clear" w:color="auto" w:fill="FFFFFF"/>
-            <w:tcMar>
-              <w:top w:w="80" w:type="dxa"/>
-              <w:left w:w="120" w:type="dxa"/>
-              <w:bottom w:w="80" w:type="dxa"/>
-              <w:right w:w="120" w:type="dxa"/>
-            </w:tcMar>
-            <w:vAlign w:val="center"/>
-          </w:tcPr>
-          <w:p>
-            <w:pPr>
-              <w:rPr>
-                <w:rFonts w:asciiTheme="majorHAnsi" w:hAnsiTheme="majorHAnsi"/>
-              </w:rPr>
-            </w:pPr>
-            <w:r>
-              <w:rPr>
-                <w:rFonts w:asciiTheme="majorHAnsi" w:hAnsiTheme="majorHAnsi"/>
-                <w:b/>
-                <w:bCs/>
-                <w:color w:val="000000"/>
-                <w:sz w:val="19"/>
-                <w:szCs w:val="19"/>
-              </w:rPr>
-              <w:t>Step 1</w:t>
-            </w:r>
-          </w:p>
-        </w:tc>
-        <w:tc>
-          <w:tcPr>
-            <w:tcW w:w="7960" w:type="dxa"/>
-            <w:shd w:val="clear" w:color="auto" w:fill="FFFFFF"/>
-            <w:tcMar>
-              <w:top w:w="80" w:type="dxa"/>
-              <w:left w:w="120" w:type="dxa"/>
-              <w:bottom w:w="80" w:type="dxa"/>
-              <w:right w:w="120" w:type="dxa"/>
-            </w:tcMar>
-            <w:vAlign w:val="center"/>
-          </w:tcPr>
-          <w:p>
-            <w:pPr>
-              <w:rPr>
-                <w:rFonts w:asciiTheme="majorHAnsi" w:hAnsiTheme="majorHAnsi"/>
-              </w:rPr>
-            </w:pPr>
-            <w:r>
-              <w:rPr>
-                <w:rFonts w:asciiTheme="majorHAnsi" w:hAnsiTheme="majorHAnsi"/>
-                <w:color w:val="000000"/>
-                <w:sz w:val="19"/>
-                <w:szCs w:val="19"/>
-              </w:rPr>
-              <w:t>Log in as administrator</w:t>
-            </w:r>
-          </w:p>
-        </w:tc>
-      </w:tr>
-      <w:tr>
-        <w:tc>
-          <w:tcPr>
-            <w:tcW w:w="1400" w:type="dxa"/>
-            <w:shd w:val="clear" w:color="auto" w:fill="F2F2F2"/>
-            <w:tcMar>
-              <w:top w:w="80" w:type="dxa"/>
-              <w:left w:w="120" w:type="dxa"/>
-              <w:bottom w:w="80" w:type="dxa"/>
-              <w:right w:w="120" w:type="dxa"/>
-            </w:tcMar>
-            <w:vAlign w:val="center"/>
-          </w:tcPr>
-          <w:p>
-            <w:pPr>
-              <w:rPr>
-                <w:rFonts w:asciiTheme="majorHAnsi" w:hAnsiTheme="majorHAnsi"/>
-              </w:rPr>
-            </w:pPr>
-            <w:r>
-              <w:rPr>
-                <w:rFonts w:asciiTheme="majorHAnsi" w:hAnsiTheme="majorHAnsi"/>
-                <w:b/>
-                <w:bCs/>
-                <w:color w:val="000000"/>
-                <w:sz w:val="19"/>
-                <w:szCs w:val="19"/>
-              </w:rPr>
-              <w:t>Step 2</w:t>
-            </w:r>
-          </w:p>
-        </w:tc>
-        <w:tc>
-          <w:tcPr>
-            <w:tcW w:w="7960" w:type="dxa"/>
-            <w:shd w:val="clear" w:color="auto" w:fill="F2F2F2"/>
-            <w:tcMar>
-              <w:top w:w="80" w:type="dxa"/>
-              <w:left w:w="120" w:type="dxa"/>
-              <w:bottom w:w="80" w:type="dxa"/>
-              <w:right w:w="120" w:type="dxa"/>
-            </w:tcMar>
-            <w:vAlign w:val="center"/>
-          </w:tcPr>
-          <w:p>
-            <w:pPr>
-              <w:rPr>
-                <w:rFonts w:asciiTheme="majorHAnsi" w:hAnsiTheme="majorHAnsi"/>
-              </w:rPr>
-            </w:pPr>
-            <w:r>
-              <w:rPr>
-                <w:rFonts w:asciiTheme="majorHAnsi" w:hAnsiTheme="majorHAnsi"/>
-                <w:color w:val="000000"/>
-                <w:sz w:val="19"/>
-                <w:szCs w:val="19"/>
-              </w:rPr>
-              <w:t>Navigate to admin dashboard</w:t>
-            </w:r>
-          </w:p>
-        </w:tc>
-      </w:tr>
-      <w:tr>
-        <w:tc>
-          <w:tcPr>
-            <w:tcW w:w="1400" w:type="dxa"/>
-            <w:shd w:val="clear" w:color="auto" w:fill="FFFFFF"/>
-            <w:tcMar>
-              <w:top w:w="80" w:type="dxa"/>
-              <w:left w:w="120" w:type="dxa"/>
-              <w:bottom w:w="80" w:type="dxa"/>
-              <w:right w:w="120" w:type="dxa"/>
-            </w:tcMar>
-            <w:vAlign w:val="center"/>
-          </w:tcPr>
-          <w:p>
-            <w:pPr>
-              <w:rPr>
-                <w:rFonts w:asciiTheme="majorHAnsi" w:hAnsiTheme="majorHAnsi"/>
-              </w:rPr>
-            </w:pPr>
-            <w:r>
-              <w:rPr>
-                <w:rFonts w:asciiTheme="majorHAnsi" w:hAnsiTheme="majorHAnsi"/>
-                <w:b/>
-                <w:bCs/>
-                <w:color w:val="000000"/>
-                <w:sz w:val="19"/>
-                <w:szCs w:val="19"/>
-              </w:rPr>
-              <w:t>Step 3</w:t>
-            </w:r>
-          </w:p>
-        </w:tc>
-        <w:tc>
-          <w:tcPr>
-            <w:tcW w:w="7960" w:type="dxa"/>
-            <w:shd w:val="clear" w:color="auto" w:fill="FFFFFF"/>
-            <w:tcMar>
-              <w:top w:w="80" w:type="dxa"/>
-              <w:left w:w="120" w:type="dxa"/>
-              <w:bottom w:w="80" w:type="dxa"/>
-              <w:right w:w="120" w:type="dxa"/>
-            </w:tcMar>
-            <w:vAlign w:val="center"/>
-          </w:tcPr>
-          <w:p>
-            <w:pPr>
-              <w:rPr>
-                <w:rFonts w:asciiTheme="majorHAnsi" w:hAnsiTheme="majorHAnsi"/>
-              </w:rPr>
-            </w:pPr>
-            <w:r>
-              <w:rPr>
-                <w:rFonts w:asciiTheme="majorHAnsi" w:hAnsiTheme="majorHAnsi"/>
-                <w:color w:val="000000"/>
-                <w:sz w:val="19"/>
-                <w:szCs w:val="19"/>
-              </w:rPr>
-              <w:t>Click Earnings Report</w:t>
-            </w:r>
-          </w:p>
-        </w:tc>
-      </w:tr>
-      <w:tr>
-        <w:tc>
-          <w:tcPr>
-            <w:tcW w:w="1400" w:type="dxa"/>
-            <w:shd w:val="clear" w:color="auto" w:fill="000000"/>
-            <w:tcMar>
-              <w:top w:w="80" w:type="dxa"/>
-              <w:left w:w="120" w:type="dxa"/>
-              <w:bottom w:w="80" w:type="dxa"/>
-              <w:right w:w="120" w:type="dxa"/>
-            </w:tcMar>
-          </w:tcPr>
-          <w:p>
-            <w:pPr>
-              <w:rPr>
-                <w:rFonts w:asciiTheme="majorHAnsi" w:hAnsiTheme="majorHAnsi"/>
-              </w:rPr>
-            </w:pPr>
-            <w:r>
-              <w:rPr>
-                <w:rFonts w:asciiTheme="majorHAnsi" w:hAnsiTheme="majorHAnsi"/>
-                <w:b/>
-                <w:bCs/>
-                <w:color w:val="FFFFFF"/>
-                <w:sz w:val="19"/>
-                <w:szCs w:val="19"/>
-              </w:rPr>
-              <w:t>Expected Result</w:t>
-            </w:r>
-          </w:p>
-        </w:tc>
-        <w:tc>
-          <w:tcPr>
-            <w:tcW w:w="7960" w:type="dxa"/>
-            <w:shd w:val="clear" w:color="auto" w:fill="EEEEEE"/>
-            <w:tcMar>
-              <w:top w:w="80" w:type="dxa"/>
-              <w:left w:w="120" w:type="dxa"/>
-              <w:bottom w:w="80" w:type="dxa"/>
-              <w:right w:w="120" w:type="dxa"/>
-            </w:tcMar>
-          </w:tcPr>
-          <w:p>
-            <w:pPr>
-              <w:rPr>
-                <w:rFonts w:asciiTheme="majorHAnsi" w:hAnsiTheme="majorHAnsi"/>
-              </w:rPr>
-            </w:pPr>
-            <w:r>
-              <w:rPr>
-                <w:rFonts w:asciiTheme="majorHAnsi" w:hAnsiTheme="majorHAnsi"/>
-                <w:color w:val="000000"/>
-                <w:sz w:val="19"/>
-                <w:szCs w:val="19"/>
-              </w:rPr>
-              <w:t>Earnings report is displayed with revenue metrics</w:t>
-            </w:r>
-          </w:p>
-        </w:tc>
-      </w:tr>
-    </w:tbl>
-    <w:p>
-      <w:pPr>
-        <w:spacing w:before="80"/>
-        <w:rPr>
-          <w:rFonts w:asciiTheme="majorHAnsi" w:hAnsiTheme="majorHAnsi"/>
-        </w:rPr>
-      </w:pPr>
-    </w:p>
-    <w:p>
-      <w:pPr>
-        <w:rPr>
-          <w:rFonts w:asciiTheme="majorHAnsi" w:hAnsiTheme="majorHAnsi"/>
-        </w:rPr>
-      </w:pPr>
-      <w:r>
-        <w:rPr>
-          <w:rFonts w:asciiTheme="majorHAnsi" w:hAnsiTheme="majorHAnsi"/>
-        </w:rPr>
-        <w:br w:type="page"/>
-      </w:r>
-    </w:p>
     <w:p>
       <w:pPr>
         <w:spacing w:before="240" w:after="100"/>
@@ -29958,7 +29599,6 @@
           <w:sz w:val="22"/>
           <w:szCs w:val="22"/>
         </w:rPr>
-        <w:lastRenderedPageBreak/>
         <w:t>4.4 Automated Test Cases</w:t>
       </w:r>
     </w:p>
@@ -31415,702 +31055,10 @@
     </w:p>
     <w:p>
       <w:pPr>
-        <w:spacing w:before="240" w:after="100"/>
         <w:rPr>
           <w:rFonts w:asciiTheme="majorHAnsi" w:hAnsiTheme="majorHAnsi"/>
         </w:rPr>
       </w:pPr>
-      <w:r>
-        <w:rPr>
-          <w:rFonts w:asciiTheme="majorHAnsi" w:hAnsiTheme="majorHAnsi"/>
-          <w:b/>
-          <w:bCs/>
-          <w:color w:val="000000"/>
-          <w:sz w:val="22"/>
-          <w:szCs w:val="22"/>
-        </w:rPr>
-        <w:t>Test Coverage Goals</w:t>
-      </w:r>
-    </w:p>
-    <w:tbl>
-      <w:tblPr>
-        <w:tblW w:w="9360" w:type="dxa"/>
-        <w:tblBorders>
-          <w:top w:val="single" w:sz="4" w:space="0" w:color="auto"/>
-          <w:left w:val="single" w:sz="4" w:space="0" w:color="auto"/>
-          <w:bottom w:val="single" w:sz="4" w:space="0" w:color="auto"/>
-          <w:right w:val="single" w:sz="4" w:space="0" w:color="auto"/>
-          <w:insideH w:val="single" w:sz="4" w:space="0" w:color="auto"/>
-          <w:insideV w:val="single" w:sz="4" w:space="0" w:color="auto"/>
-        </w:tblBorders>
-        <w:tblCellMar>
-          <w:left w:w="10" w:type="dxa"/>
-          <w:right w:w="10" w:type="dxa"/>
-        </w:tblCellMar>
-        <w:tblLook w:val="04A0" w:firstRow="1" w:lastRow="0" w:firstColumn="1" w:lastColumn="0" w:noHBand="0" w:noVBand="1"/>
-      </w:tblPr>
-      <w:tblGrid>
-        <w:gridCol w:w="3000"/>
-        <w:gridCol w:w="1800"/>
-        <w:gridCol w:w="4560"/>
-      </w:tblGrid>
-      <w:tr>
-        <w:tc>
-          <w:tcPr>
-            <w:tcW w:w="3000" w:type="dxa"/>
-            <w:shd w:val="clear" w:color="auto" w:fill="000000"/>
-            <w:tcMar>
-              <w:top w:w="100" w:type="dxa"/>
-              <w:left w:w="120" w:type="dxa"/>
-              <w:bottom w:w="100" w:type="dxa"/>
-              <w:right w:w="120" w:type="dxa"/>
-            </w:tcMar>
-            <w:vAlign w:val="center"/>
-          </w:tcPr>
-          <w:p>
-            <w:pPr>
-              <w:jc w:val="center"/>
-              <w:rPr>
-                <w:rFonts w:asciiTheme="majorHAnsi" w:hAnsiTheme="majorHAnsi"/>
-              </w:rPr>
-            </w:pPr>
-            <w:r>
-              <w:rPr>
-                <w:rFonts w:asciiTheme="majorHAnsi" w:hAnsiTheme="majorHAnsi"/>
-                <w:b/>
-                <w:bCs/>
-                <w:color w:val="FFFFFF"/>
-              </w:rPr>
-              <w:t>Module / Feature</w:t>
-            </w:r>
-          </w:p>
-        </w:tc>
-        <w:tc>
-          <w:tcPr>
-            <w:tcW w:w="1800" w:type="dxa"/>
-            <w:shd w:val="clear" w:color="auto" w:fill="000000"/>
-            <w:tcMar>
-              <w:top w:w="100" w:type="dxa"/>
-              <w:left w:w="120" w:type="dxa"/>
-              <w:bottom w:w="100" w:type="dxa"/>
-              <w:right w:w="120" w:type="dxa"/>
-            </w:tcMar>
-            <w:vAlign w:val="center"/>
-          </w:tcPr>
-          <w:p>
-            <w:pPr>
-              <w:jc w:val="center"/>
-              <w:rPr>
-                <w:rFonts w:asciiTheme="majorHAnsi" w:hAnsiTheme="majorHAnsi"/>
-              </w:rPr>
-            </w:pPr>
-            <w:r>
-              <w:rPr>
-                <w:rFonts w:asciiTheme="majorHAnsi" w:hAnsiTheme="majorHAnsi"/>
-                <w:b/>
-                <w:bCs/>
-                <w:color w:val="FFFFFF"/>
-              </w:rPr>
-              <w:t>Target Coverage</w:t>
-            </w:r>
-          </w:p>
-        </w:tc>
-        <w:tc>
-          <w:tcPr>
-            <w:tcW w:w="4560" w:type="dxa"/>
-            <w:shd w:val="clear" w:color="auto" w:fill="000000"/>
-            <w:tcMar>
-              <w:top w:w="100" w:type="dxa"/>
-              <w:left w:w="120" w:type="dxa"/>
-              <w:bottom w:w="100" w:type="dxa"/>
-              <w:right w:w="120" w:type="dxa"/>
-            </w:tcMar>
-            <w:vAlign w:val="center"/>
-          </w:tcPr>
-          <w:p>
-            <w:pPr>
-              <w:jc w:val="center"/>
-              <w:rPr>
-                <w:rFonts w:asciiTheme="majorHAnsi" w:hAnsiTheme="majorHAnsi"/>
-              </w:rPr>
-            </w:pPr>
-            <w:r>
-              <w:rPr>
-                <w:rFonts w:asciiTheme="majorHAnsi" w:hAnsiTheme="majorHAnsi"/>
-                <w:b/>
-                <w:bCs/>
-                <w:color w:val="FFFFFF"/>
-              </w:rPr>
-              <w:t>Scope</w:t>
-            </w:r>
-          </w:p>
-        </w:tc>
-      </w:tr>
-      <w:tr>
-        <w:tc>
-          <w:tcPr>
-            <w:tcW w:w="3000" w:type="dxa"/>
-            <w:shd w:val="clear" w:color="auto" w:fill="FFFFFF"/>
-            <w:tcMar>
-              <w:top w:w="80" w:type="dxa"/>
-              <w:left w:w="120" w:type="dxa"/>
-              <w:bottom w:w="80" w:type="dxa"/>
-              <w:right w:w="120" w:type="dxa"/>
-            </w:tcMar>
-            <w:vAlign w:val="center"/>
-          </w:tcPr>
-          <w:p>
-            <w:pPr>
-              <w:rPr>
-                <w:rFonts w:asciiTheme="majorHAnsi" w:hAnsiTheme="majorHAnsi"/>
-              </w:rPr>
-            </w:pPr>
-            <w:r>
-              <w:rPr>
-                <w:rFonts w:asciiTheme="majorHAnsi" w:hAnsiTheme="majorHAnsi"/>
-                <w:b/>
-                <w:bCs/>
-                <w:color w:val="000000"/>
-                <w:sz w:val="19"/>
-                <w:szCs w:val="19"/>
-              </w:rPr>
-              <w:t>Authentication</w:t>
-            </w:r>
-          </w:p>
-        </w:tc>
-        <w:tc>
-          <w:tcPr>
-            <w:tcW w:w="1800" w:type="dxa"/>
-            <w:shd w:val="clear" w:color="auto" w:fill="FFFFFF"/>
-            <w:tcMar>
-              <w:top w:w="80" w:type="dxa"/>
-              <w:left w:w="120" w:type="dxa"/>
-              <w:bottom w:w="80" w:type="dxa"/>
-              <w:right w:w="120" w:type="dxa"/>
-            </w:tcMar>
-            <w:vAlign w:val="center"/>
-          </w:tcPr>
-          <w:p>
-            <w:pPr>
-              <w:jc w:val="center"/>
-              <w:rPr>
-                <w:rFonts w:asciiTheme="majorHAnsi" w:hAnsiTheme="majorHAnsi"/>
-              </w:rPr>
-            </w:pPr>
-            <w:r>
-              <w:rPr>
-                <w:rFonts w:asciiTheme="majorHAnsi" w:hAnsiTheme="majorHAnsi"/>
-                <w:color w:val="000000"/>
-                <w:sz w:val="19"/>
-                <w:szCs w:val="19"/>
-              </w:rPr>
-              <w:t>100%</w:t>
-            </w:r>
-          </w:p>
-        </w:tc>
-        <w:tc>
-          <w:tcPr>
-            <w:tcW w:w="4560" w:type="dxa"/>
-            <w:shd w:val="clear" w:color="auto" w:fill="FFFFFF"/>
-            <w:tcMar>
-              <w:top w:w="80" w:type="dxa"/>
-              <w:left w:w="120" w:type="dxa"/>
-              <w:bottom w:w="80" w:type="dxa"/>
-              <w:right w:w="120" w:type="dxa"/>
-            </w:tcMar>
-            <w:vAlign w:val="center"/>
-          </w:tcPr>
-          <w:p>
-            <w:pPr>
-              <w:rPr>
-                <w:rFonts w:asciiTheme="majorHAnsi" w:hAnsiTheme="majorHAnsi"/>
-              </w:rPr>
-            </w:pPr>
-            <w:r>
-              <w:rPr>
-                <w:rFonts w:asciiTheme="majorHAnsi" w:hAnsiTheme="majorHAnsi"/>
-                <w:color w:val="000000"/>
-                <w:sz w:val="19"/>
-                <w:szCs w:val="19"/>
-              </w:rPr>
-              <w:t>Login, registration, OAuth flows</w:t>
-            </w:r>
-          </w:p>
-        </w:tc>
-      </w:tr>
-      <w:tr>
-        <w:tc>
-          <w:tcPr>
-            <w:tcW w:w="3000" w:type="dxa"/>
-            <w:shd w:val="clear" w:color="auto" w:fill="F2F2F2"/>
-            <w:tcMar>
-              <w:top w:w="80" w:type="dxa"/>
-              <w:left w:w="120" w:type="dxa"/>
-              <w:bottom w:w="80" w:type="dxa"/>
-              <w:right w:w="120" w:type="dxa"/>
-            </w:tcMar>
-            <w:vAlign w:val="center"/>
-          </w:tcPr>
-          <w:p>
-            <w:pPr>
-              <w:rPr>
-                <w:rFonts w:asciiTheme="majorHAnsi" w:hAnsiTheme="majorHAnsi"/>
-              </w:rPr>
-            </w:pPr>
-            <w:r>
-              <w:rPr>
-                <w:rFonts w:asciiTheme="majorHAnsi" w:hAnsiTheme="majorHAnsi"/>
-                <w:b/>
-                <w:bCs/>
-                <w:color w:val="000000"/>
-                <w:sz w:val="19"/>
-                <w:szCs w:val="19"/>
-              </w:rPr>
-              <w:t>Book Management</w:t>
-            </w:r>
-          </w:p>
-        </w:tc>
-        <w:tc>
-          <w:tcPr>
-            <w:tcW w:w="1800" w:type="dxa"/>
-            <w:shd w:val="clear" w:color="auto" w:fill="F2F2F2"/>
-            <w:tcMar>
-              <w:top w:w="80" w:type="dxa"/>
-              <w:left w:w="120" w:type="dxa"/>
-              <w:bottom w:w="80" w:type="dxa"/>
-              <w:right w:w="120" w:type="dxa"/>
-            </w:tcMar>
-            <w:vAlign w:val="center"/>
-          </w:tcPr>
-          <w:p>
-            <w:pPr>
-              <w:jc w:val="center"/>
-              <w:rPr>
-                <w:rFonts w:asciiTheme="majorHAnsi" w:hAnsiTheme="majorHAnsi"/>
-              </w:rPr>
-            </w:pPr>
-            <w:r>
-              <w:rPr>
-                <w:rFonts w:asciiTheme="majorHAnsi" w:hAnsiTheme="majorHAnsi"/>
-                <w:color w:val="000000"/>
-                <w:sz w:val="19"/>
-                <w:szCs w:val="19"/>
-              </w:rPr>
-              <w:t>95%</w:t>
-            </w:r>
-          </w:p>
-        </w:tc>
-        <w:tc>
-          <w:tcPr>
-            <w:tcW w:w="4560" w:type="dxa"/>
-            <w:shd w:val="clear" w:color="auto" w:fill="F2F2F2"/>
-            <w:tcMar>
-              <w:top w:w="80" w:type="dxa"/>
-              <w:left w:w="120" w:type="dxa"/>
-              <w:bottom w:w="80" w:type="dxa"/>
-              <w:right w:w="120" w:type="dxa"/>
-            </w:tcMar>
-            <w:vAlign w:val="center"/>
-          </w:tcPr>
-          <w:p>
-            <w:pPr>
-              <w:rPr>
-                <w:rFonts w:asciiTheme="majorHAnsi" w:hAnsiTheme="majorHAnsi"/>
-              </w:rPr>
-            </w:pPr>
-            <w:r>
-              <w:rPr>
-                <w:rFonts w:asciiTheme="majorHAnsi" w:hAnsiTheme="majorHAnsi"/>
-                <w:color w:val="000000"/>
-                <w:sz w:val="19"/>
-                <w:szCs w:val="19"/>
-              </w:rPr>
-              <w:t>CRUD operations</w:t>
-            </w:r>
-          </w:p>
-        </w:tc>
-      </w:tr>
-      <w:tr>
-        <w:tc>
-          <w:tcPr>
-            <w:tcW w:w="3000" w:type="dxa"/>
-            <w:shd w:val="clear" w:color="auto" w:fill="FFFFFF"/>
-            <w:tcMar>
-              <w:top w:w="80" w:type="dxa"/>
-              <w:left w:w="120" w:type="dxa"/>
-              <w:bottom w:w="80" w:type="dxa"/>
-              <w:right w:w="120" w:type="dxa"/>
-            </w:tcMar>
-            <w:vAlign w:val="center"/>
-          </w:tcPr>
-          <w:p>
-            <w:pPr>
-              <w:rPr>
-                <w:rFonts w:asciiTheme="majorHAnsi" w:hAnsiTheme="majorHAnsi"/>
-              </w:rPr>
-            </w:pPr>
-            <w:r>
-              <w:rPr>
-                <w:rFonts w:asciiTheme="majorHAnsi" w:hAnsiTheme="majorHAnsi"/>
-                <w:b/>
-                <w:bCs/>
-                <w:color w:val="000000"/>
-                <w:sz w:val="19"/>
-                <w:szCs w:val="19"/>
-              </w:rPr>
-              <w:t>User Management</w:t>
-            </w:r>
-          </w:p>
-        </w:tc>
-        <w:tc>
-          <w:tcPr>
-            <w:tcW w:w="1800" w:type="dxa"/>
-            <w:shd w:val="clear" w:color="auto" w:fill="FFFFFF"/>
-            <w:tcMar>
-              <w:top w:w="80" w:type="dxa"/>
-              <w:left w:w="120" w:type="dxa"/>
-              <w:bottom w:w="80" w:type="dxa"/>
-              <w:right w:w="120" w:type="dxa"/>
-            </w:tcMar>
-            <w:vAlign w:val="center"/>
-          </w:tcPr>
-          <w:p>
-            <w:pPr>
-              <w:jc w:val="center"/>
-              <w:rPr>
-                <w:rFonts w:asciiTheme="majorHAnsi" w:hAnsiTheme="majorHAnsi"/>
-              </w:rPr>
-            </w:pPr>
-            <w:r>
-              <w:rPr>
-                <w:rFonts w:asciiTheme="majorHAnsi" w:hAnsiTheme="majorHAnsi"/>
-                <w:color w:val="000000"/>
-                <w:sz w:val="19"/>
-                <w:szCs w:val="19"/>
-              </w:rPr>
-              <w:t>90%</w:t>
-            </w:r>
-          </w:p>
-        </w:tc>
-        <w:tc>
-          <w:tcPr>
-            <w:tcW w:w="4560" w:type="dxa"/>
-            <w:shd w:val="clear" w:color="auto" w:fill="FFFFFF"/>
-            <w:tcMar>
-              <w:top w:w="80" w:type="dxa"/>
-              <w:left w:w="120" w:type="dxa"/>
-              <w:bottom w:w="80" w:type="dxa"/>
-              <w:right w:w="120" w:type="dxa"/>
-            </w:tcMar>
-            <w:vAlign w:val="center"/>
-          </w:tcPr>
-          <w:p>
-            <w:pPr>
-              <w:rPr>
-                <w:rFonts w:asciiTheme="majorHAnsi" w:hAnsiTheme="majorHAnsi"/>
-              </w:rPr>
-            </w:pPr>
-            <w:r>
-              <w:rPr>
-                <w:rFonts w:asciiTheme="majorHAnsi" w:hAnsiTheme="majorHAnsi"/>
-                <w:color w:val="000000"/>
-                <w:sz w:val="19"/>
-                <w:szCs w:val="19"/>
-              </w:rPr>
-              <w:t>Profile operations</w:t>
-            </w:r>
-          </w:p>
-        </w:tc>
-      </w:tr>
-      <w:tr>
-        <w:tc>
-          <w:tcPr>
-            <w:tcW w:w="3000" w:type="dxa"/>
-            <w:shd w:val="clear" w:color="auto" w:fill="F2F2F2"/>
-            <w:tcMar>
-              <w:top w:w="80" w:type="dxa"/>
-              <w:left w:w="120" w:type="dxa"/>
-              <w:bottom w:w="80" w:type="dxa"/>
-              <w:right w:w="120" w:type="dxa"/>
-            </w:tcMar>
-            <w:vAlign w:val="center"/>
-          </w:tcPr>
-          <w:p>
-            <w:pPr>
-              <w:rPr>
-                <w:rFonts w:asciiTheme="majorHAnsi" w:hAnsiTheme="majorHAnsi"/>
-              </w:rPr>
-            </w:pPr>
-            <w:r>
-              <w:rPr>
-                <w:rFonts w:asciiTheme="majorHAnsi" w:hAnsiTheme="majorHAnsi"/>
-                <w:b/>
-                <w:bCs/>
-                <w:color w:val="000000"/>
-                <w:sz w:val="19"/>
-                <w:szCs w:val="19"/>
-              </w:rPr>
-              <w:t>Transactions</w:t>
-            </w:r>
-          </w:p>
-        </w:tc>
-        <w:tc>
-          <w:tcPr>
-            <w:tcW w:w="1800" w:type="dxa"/>
-            <w:shd w:val="clear" w:color="auto" w:fill="F2F2F2"/>
-            <w:tcMar>
-              <w:top w:w="80" w:type="dxa"/>
-              <w:left w:w="120" w:type="dxa"/>
-              <w:bottom w:w="80" w:type="dxa"/>
-              <w:right w:w="120" w:type="dxa"/>
-            </w:tcMar>
-            <w:vAlign w:val="center"/>
-          </w:tcPr>
-          <w:p>
-            <w:pPr>
-              <w:jc w:val="center"/>
-              <w:rPr>
-                <w:rFonts w:asciiTheme="majorHAnsi" w:hAnsiTheme="majorHAnsi"/>
-              </w:rPr>
-            </w:pPr>
-            <w:r>
-              <w:rPr>
-                <w:rFonts w:asciiTheme="majorHAnsi" w:hAnsiTheme="majorHAnsi"/>
-                <w:color w:val="000000"/>
-                <w:sz w:val="19"/>
-                <w:szCs w:val="19"/>
-              </w:rPr>
-              <w:t>85%</w:t>
-            </w:r>
-          </w:p>
-        </w:tc>
-        <w:tc>
-          <w:tcPr>
-            <w:tcW w:w="4560" w:type="dxa"/>
-            <w:shd w:val="clear" w:color="auto" w:fill="F2F2F2"/>
-            <w:tcMar>
-              <w:top w:w="80" w:type="dxa"/>
-              <w:left w:w="120" w:type="dxa"/>
-              <w:bottom w:w="80" w:type="dxa"/>
-              <w:right w:w="120" w:type="dxa"/>
-            </w:tcMar>
-            <w:vAlign w:val="center"/>
-          </w:tcPr>
-          <w:p>
-            <w:pPr>
-              <w:rPr>
-                <w:rFonts w:asciiTheme="majorHAnsi" w:hAnsiTheme="majorHAnsi"/>
-              </w:rPr>
-            </w:pPr>
-            <w:r>
-              <w:rPr>
-                <w:rFonts w:asciiTheme="majorHAnsi" w:hAnsiTheme="majorHAnsi"/>
-                <w:color w:val="000000"/>
-                <w:sz w:val="19"/>
-                <w:szCs w:val="19"/>
-              </w:rPr>
-              <w:t>Payment flows</w:t>
-            </w:r>
-          </w:p>
-        </w:tc>
-      </w:tr>
-      <w:tr>
-        <w:tc>
-          <w:tcPr>
-            <w:tcW w:w="3000" w:type="dxa"/>
-            <w:shd w:val="clear" w:color="auto" w:fill="FFFFFF"/>
-            <w:tcMar>
-              <w:top w:w="80" w:type="dxa"/>
-              <w:left w:w="120" w:type="dxa"/>
-              <w:bottom w:w="80" w:type="dxa"/>
-              <w:right w:w="120" w:type="dxa"/>
-            </w:tcMar>
-            <w:vAlign w:val="center"/>
-          </w:tcPr>
-          <w:p>
-            <w:pPr>
-              <w:rPr>
-                <w:rFonts w:asciiTheme="majorHAnsi" w:hAnsiTheme="majorHAnsi"/>
-              </w:rPr>
-            </w:pPr>
-            <w:r>
-              <w:rPr>
-                <w:rFonts w:asciiTheme="majorHAnsi" w:hAnsiTheme="majorHAnsi"/>
-                <w:b/>
-                <w:bCs/>
-                <w:color w:val="000000"/>
-                <w:sz w:val="19"/>
-                <w:szCs w:val="19"/>
-              </w:rPr>
-              <w:t>Admin Functions</w:t>
-            </w:r>
-          </w:p>
-        </w:tc>
-        <w:tc>
-          <w:tcPr>
-            <w:tcW w:w="1800" w:type="dxa"/>
-            <w:shd w:val="clear" w:color="auto" w:fill="FFFFFF"/>
-            <w:tcMar>
-              <w:top w:w="80" w:type="dxa"/>
-              <w:left w:w="120" w:type="dxa"/>
-              <w:bottom w:w="80" w:type="dxa"/>
-              <w:right w:w="120" w:type="dxa"/>
-            </w:tcMar>
-            <w:vAlign w:val="center"/>
-          </w:tcPr>
-          <w:p>
-            <w:pPr>
-              <w:jc w:val="center"/>
-              <w:rPr>
-                <w:rFonts w:asciiTheme="majorHAnsi" w:hAnsiTheme="majorHAnsi"/>
-              </w:rPr>
-            </w:pPr>
-            <w:r>
-              <w:rPr>
-                <w:rFonts w:asciiTheme="majorHAnsi" w:hAnsiTheme="majorHAnsi"/>
-                <w:color w:val="000000"/>
-                <w:sz w:val="19"/>
-                <w:szCs w:val="19"/>
-              </w:rPr>
-              <w:t>80%</w:t>
-            </w:r>
-          </w:p>
-        </w:tc>
-        <w:tc>
-          <w:tcPr>
-            <w:tcW w:w="4560" w:type="dxa"/>
-            <w:shd w:val="clear" w:color="auto" w:fill="FFFFFF"/>
-            <w:tcMar>
-              <w:top w:w="80" w:type="dxa"/>
-              <w:left w:w="120" w:type="dxa"/>
-              <w:bottom w:w="80" w:type="dxa"/>
-              <w:right w:w="120" w:type="dxa"/>
-            </w:tcMar>
-            <w:vAlign w:val="center"/>
-          </w:tcPr>
-          <w:p>
-            <w:pPr>
-              <w:rPr>
-                <w:rFonts w:asciiTheme="majorHAnsi" w:hAnsiTheme="majorHAnsi"/>
-              </w:rPr>
-            </w:pPr>
-            <w:r>
-              <w:rPr>
-                <w:rFonts w:asciiTheme="majorHAnsi" w:hAnsiTheme="majorHAnsi"/>
-                <w:color w:val="000000"/>
-                <w:sz w:val="19"/>
-                <w:szCs w:val="19"/>
-              </w:rPr>
-              <w:t>Administrative features</w:t>
-            </w:r>
-          </w:p>
-        </w:tc>
-      </w:tr>
-      <w:tr>
-        <w:tc>
-          <w:tcPr>
-            <w:tcW w:w="3000" w:type="dxa"/>
-            <w:shd w:val="clear" w:color="auto" w:fill="F2F2F2"/>
-            <w:tcMar>
-              <w:top w:w="80" w:type="dxa"/>
-              <w:left w:w="120" w:type="dxa"/>
-              <w:bottom w:w="80" w:type="dxa"/>
-              <w:right w:w="120" w:type="dxa"/>
-            </w:tcMar>
-            <w:vAlign w:val="center"/>
-          </w:tcPr>
-          <w:p>
-            <w:pPr>
-              <w:rPr>
-                <w:rFonts w:asciiTheme="majorHAnsi" w:hAnsiTheme="majorHAnsi"/>
-              </w:rPr>
-            </w:pPr>
-            <w:r>
-              <w:rPr>
-                <w:rFonts w:asciiTheme="majorHAnsi" w:hAnsiTheme="majorHAnsi"/>
-                <w:b/>
-                <w:bCs/>
-                <w:color w:val="000000"/>
-                <w:sz w:val="19"/>
-                <w:szCs w:val="19"/>
-              </w:rPr>
-              <w:t>Overall System</w:t>
-            </w:r>
-          </w:p>
-        </w:tc>
-        <w:tc>
-          <w:tcPr>
-            <w:tcW w:w="1800" w:type="dxa"/>
-            <w:shd w:val="clear" w:color="auto" w:fill="F2F2F2"/>
-            <w:tcMar>
-              <w:top w:w="80" w:type="dxa"/>
-              <w:left w:w="120" w:type="dxa"/>
-              <w:bottom w:w="80" w:type="dxa"/>
-              <w:right w:w="120" w:type="dxa"/>
-            </w:tcMar>
-            <w:vAlign w:val="center"/>
-          </w:tcPr>
-          <w:p>
-            <w:pPr>
-              <w:jc w:val="center"/>
-              <w:rPr>
-                <w:rFonts w:asciiTheme="majorHAnsi" w:hAnsiTheme="majorHAnsi"/>
-              </w:rPr>
-            </w:pPr>
-            <w:r>
-              <w:rPr>
-                <w:rFonts w:asciiTheme="majorHAnsi" w:hAnsiTheme="majorHAnsi"/>
-                <w:color w:val="000000"/>
-                <w:sz w:val="19"/>
-                <w:szCs w:val="19"/>
-              </w:rPr>
-              <w:t>85% minimum</w:t>
-            </w:r>
-          </w:p>
-        </w:tc>
-        <w:tc>
-          <w:tcPr>
-            <w:tcW w:w="4560" w:type="dxa"/>
-            <w:shd w:val="clear" w:color="auto" w:fill="F2F2F2"/>
-            <w:tcMar>
-              <w:top w:w="80" w:type="dxa"/>
-              <w:left w:w="120" w:type="dxa"/>
-              <w:bottom w:w="80" w:type="dxa"/>
-              <w:right w:w="120" w:type="dxa"/>
-            </w:tcMar>
-            <w:vAlign w:val="center"/>
-          </w:tcPr>
-          <w:p>
-            <w:pPr>
-              <w:rPr>
-                <w:rFonts w:asciiTheme="majorHAnsi" w:hAnsiTheme="majorHAnsi"/>
-              </w:rPr>
-            </w:pPr>
-            <w:r>
-              <w:rPr>
-                <w:rFonts w:asciiTheme="majorHAnsi" w:hAnsiTheme="majorHAnsi"/>
-                <w:color w:val="000000"/>
-                <w:sz w:val="19"/>
-                <w:szCs w:val="19"/>
-              </w:rPr>
-              <w:t>All modules combined</w:t>
-            </w:r>
-          </w:p>
-        </w:tc>
-      </w:tr>
-    </w:tbl>
-    <w:p>
-      <w:pPr>
-        <w:rPr>
-          <w:rFonts w:asciiTheme="majorHAnsi" w:hAnsiTheme="majorHAnsi"/>
-        </w:rPr>
-      </w:pPr>
-      <w:r>
-        <w:rPr>
-          <w:rFonts w:asciiTheme="majorHAnsi" w:hAnsiTheme="majorHAnsi"/>
-        </w:rPr>
-        <w:br w:type="page"/>
-      </w:r>
     </w:p>
     <w:p>
       <w:pPr>
@@ -32766,7 +31714,7 @@
                           </pic:cNvPicPr>
                         </pic:nvPicPr>
                         <pic:blipFill>
-                          <a:blip r:embed="rId16" cstate="print">
+                          <a:blip r:embed="rId14" cstate="print">
                             <a:extLst>
                               <a:ext uri="{28A0092B-C50C-407E-A947-70E740481C1C}">
                                 <a14:useLocalDpi xmlns:a14="http://schemas.microsoft.com/office/drawing/2010/main" val="0"/>
@@ -33007,7 +31955,7 @@
                           <pic:cNvPicPr/>
                         </pic:nvPicPr>
                         <pic:blipFill>
-                          <a:blip r:embed="rId17"/>
+                          <a:blip r:embed="rId15"/>
                           <a:stretch>
                             <a:fillRect/>
                           </a:stretch>
@@ -33243,7 +32191,7 @@
                           <pic:cNvPicPr/>
                         </pic:nvPicPr>
                         <pic:blipFill>
-                          <a:blip r:embed="rId18"/>
+                          <a:blip r:embed="rId16"/>
                           <a:stretch>
                             <a:fillRect/>
                           </a:stretch>
@@ -33458,7 +32406,7 @@
                           <pic:cNvPicPr/>
                         </pic:nvPicPr>
                         <pic:blipFill>
-                          <a:blip r:embed="rId19"/>
+                          <a:blip r:embed="rId17"/>
                           <a:stretch>
                             <a:fillRect/>
                           </a:stretch>
@@ -33673,7 +32621,7 @@
                           <pic:cNvPicPr/>
                         </pic:nvPicPr>
                         <pic:blipFill>
-                          <a:blip r:embed="rId20"/>
+                          <a:blip r:embed="rId18"/>
                           <a:stretch>
                             <a:fillRect/>
                           </a:stretch>
@@ -33889,7 +32837,7 @@
                           <pic:cNvPicPr/>
                         </pic:nvPicPr>
                         <pic:blipFill>
-                          <a:blip r:embed="rId21"/>
+                          <a:blip r:embed="rId19"/>
                           <a:stretch>
                             <a:fillRect/>
                           </a:stretch>
@@ -34104,7 +33052,7 @@
                           <pic:cNvPicPr/>
                         </pic:nvPicPr>
                         <pic:blipFill>
-                          <a:blip r:embed="rId22"/>
+                          <a:blip r:embed="rId20"/>
                           <a:stretch>
                             <a:fillRect/>
                           </a:stretch>
@@ -34319,7 +33267,7 @@
                           <pic:cNvPicPr/>
                         </pic:nvPicPr>
                         <pic:blipFill>
-                          <a:blip r:embed="rId23"/>
+                          <a:blip r:embed="rId21"/>
                           <a:stretch>
                             <a:fillRect/>
                           </a:stretch>
@@ -34534,7 +33482,7 @@
                           <pic:cNvPicPr/>
                         </pic:nvPicPr>
                         <pic:blipFill>
-                          <a:blip r:embed="rId24"/>
+                          <a:blip r:embed="rId22"/>
                           <a:stretch>
                             <a:fillRect/>
                           </a:stretch>
@@ -34750,7 +33698,7 @@
                           <pic:cNvPicPr/>
                         </pic:nvPicPr>
                         <pic:blipFill>
-                          <a:blip r:embed="rId25"/>
+                          <a:blip r:embed="rId23"/>
                           <a:stretch>
                             <a:fillRect/>
                           </a:stretch>
@@ -34808,7 +33756,7 @@
                           <pic:cNvPicPr/>
                         </pic:nvPicPr>
                         <pic:blipFill rotWithShape="1">
-                          <a:blip r:embed="rId26"/>
+                          <a:blip r:embed="rId24"/>
                           <a:srcRect r="25650"/>
                           <a:stretch>
                             <a:fillRect/>
@@ -35041,7 +33989,7 @@
                           </pic:cNvPicPr>
                         </pic:nvPicPr>
                         <pic:blipFill rotWithShape="1">
-                          <a:blip r:embed="rId27" cstate="print">
+                          <a:blip r:embed="rId25" cstate="print">
                             <a:extLst>
                               <a:ext uri="{28A0092B-C50C-407E-A947-70E740481C1C}">
                                 <a14:useLocalDpi xmlns:a14="http://schemas.microsoft.com/office/drawing/2010/main" val="0"/>
@@ -35124,7 +34072,7 @@
                           </pic:cNvPicPr>
                         </pic:nvPicPr>
                         <pic:blipFill rotWithShape="1">
-                          <a:blip r:embed="rId28" cstate="print">
+                          <a:blip r:embed="rId26" cstate="print">
                             <a:extLst>
                               <a:ext uri="{28A0092B-C50C-407E-A947-70E740481C1C}">
                                 <a14:useLocalDpi xmlns:a14="http://schemas.microsoft.com/office/drawing/2010/main" val="0"/>
@@ -35356,7 +34304,7 @@
                           <pic:cNvPicPr/>
                         </pic:nvPicPr>
                         <pic:blipFill rotWithShape="1">
-                          <a:blip r:embed="rId29"/>
+                          <a:blip r:embed="rId27"/>
                           <a:srcRect l="-176" r="13054"/>
                           <a:stretch>
                             <a:fillRect/>
@@ -35604,7 +34552,7 @@
                           <pic:cNvPicPr/>
                         </pic:nvPicPr>
                         <pic:blipFill rotWithShape="1">
-                          <a:blip r:embed="rId30"/>
+                          <a:blip r:embed="rId28"/>
                           <a:srcRect l="639" r="-1"/>
                           <a:stretch>
                             <a:fillRect/>
@@ -35849,7 +34797,7 @@
                           </pic:cNvPicPr>
                         </pic:nvPicPr>
                         <pic:blipFill rotWithShape="1">
-                          <a:blip r:embed="rId31" cstate="print">
+                          <a:blip r:embed="rId29" cstate="print">
                             <a:extLst>
                               <a:ext uri="{28A0092B-C50C-407E-A947-70E740481C1C}">
                                 <a14:useLocalDpi xmlns:a14="http://schemas.microsoft.com/office/drawing/2010/main" val="0"/>
@@ -36115,7 +35063,7 @@
                           <pic:cNvPicPr/>
                         </pic:nvPicPr>
                         <pic:blipFill rotWithShape="1">
-                          <a:blip r:embed="rId32"/>
+                          <a:blip r:embed="rId30"/>
                           <a:srcRect r="15401"/>
                           <a:stretch>
                             <a:fillRect/>
@@ -36340,7 +35288,7 @@
                           <pic:cNvPicPr/>
                         </pic:nvPicPr>
                         <pic:blipFill>
-                          <a:blip r:embed="rId33"/>
+                          <a:blip r:embed="rId31"/>
                           <a:stretch>
                             <a:fillRect/>
                           </a:stretch>
@@ -36557,7 +35505,7 @@
                           <pic:cNvPicPr/>
                         </pic:nvPicPr>
                         <pic:blipFill>
-                          <a:blip r:embed="rId34"/>
+                          <a:blip r:embed="rId32"/>
                           <a:stretch>
                             <a:fillRect/>
                           </a:stretch>
@@ -36728,7 +35676,7 @@
                 <w:sz w:val="19"/>
                 <w:szCs w:val="19"/>
               </w:rPr>
-              <w:t>[Notes]</w:t>
+              <w:t>Payment status correctly displayed as pending, completed, or failed</w:t>
             </w:r>
           </w:p>
         </w:tc>
@@ -36784,7 +35732,7 @@
                           </pic:cNvPicPr>
                         </pic:nvPicPr>
                         <pic:blipFill>
-                          <a:blip r:embed="rId35" cstate="print">
+                          <a:blip r:embed="rId33" cstate="print">
                             <a:extLst>
                               <a:ext uri="{28A0092B-C50C-407E-A947-70E740481C1C}">
                                 <a14:useLocalDpi xmlns:a14="http://schemas.microsoft.com/office/drawing/2010/main" val="0"/>
@@ -36984,7 +35932,7 @@
                 <w:sz w:val="19"/>
                 <w:szCs w:val="19"/>
               </w:rPr>
-              <w:t>[Notes]</w:t>
+              <w:t>Dashboard loaded with listings, transactions, and notifications overview</w:t>
             </w:r>
           </w:p>
         </w:tc>
@@ -37027,7 +35975,7 @@
                           </pic:cNvPicPr>
                         </pic:nvPicPr>
                         <pic:blipFill>
-                          <a:blip r:embed="rId36" cstate="print">
+                          <a:blip r:embed="rId34" cstate="print">
                             <a:extLst>
                               <a:ext uri="{28A0092B-C50C-407E-A947-70E740481C1C}">
                                 <a14:useLocalDpi xmlns:a14="http://schemas.microsoft.com/office/drawing/2010/main" val="0"/>
@@ -37255,7 +36203,7 @@
                           <pic:cNvPicPr/>
                         </pic:nvPicPr>
                         <pic:blipFill rotWithShape="1">
-                          <a:blip r:embed="rId37"/>
+                          <a:blip r:embed="rId35"/>
                           <a:srcRect l="1704" r="2863"/>
                           <a:stretch>
                             <a:fillRect/>
@@ -37482,7 +36430,7 @@
                           <pic:cNvPicPr/>
                         </pic:nvPicPr>
                         <pic:blipFill>
-                          <a:blip r:embed="rId38" cstate="print">
+                          <a:blip r:embed="rId36" cstate="print">
                             <a:extLst>
                               <a:ext uri="{28A0092B-C50C-407E-A947-70E740481C1C}">
                                 <a14:useLocalDpi xmlns:a14="http://schemas.microsoft.com/office/drawing/2010/main" val="0"/>
@@ -37705,7 +36653,7 @@
                           <pic:cNvPicPr/>
                         </pic:nvPicPr>
                         <pic:blipFill rotWithShape="1">
-                          <a:blip r:embed="rId39"/>
+                          <a:blip r:embed="rId37"/>
                           <a:srcRect r="7982"/>
                           <a:stretch>
                             <a:fillRect/>
@@ -37931,7 +36879,7 @@
                           <pic:cNvPicPr/>
                         </pic:nvPicPr>
                         <pic:blipFill>
-                          <a:blip r:embed="rId40"/>
+                          <a:blip r:embed="rId38"/>
                           <a:stretch>
                             <a:fillRect/>
                           </a:stretch>
@@ -38148,7 +37096,7 @@
                           <pic:cNvPicPr/>
                         </pic:nvPicPr>
                         <pic:blipFill>
-                          <a:blip r:embed="rId41"/>
+                          <a:blip r:embed="rId39"/>
                           <a:stretch>
                             <a:fillRect/>
                           </a:stretch>
@@ -38365,7 +37313,7 @@
                           <pic:cNvPicPr/>
                         </pic:nvPicPr>
                         <pic:blipFill>
-                          <a:blip r:embed="rId42"/>
+                          <a:blip r:embed="rId40"/>
                           <a:stretch>
                             <a:fillRect/>
                           </a:stretch>
@@ -38589,6 +37537,17 @@
                 <w:szCs w:val="19"/>
               </w:rPr>
               <w:t>2</w:t>
+            </w:r>
+            <w:r>
+              <w:rPr>
+                <w:rFonts w:asciiTheme="majorHAnsi" w:hAnsiTheme="majorHAnsi"/>
+                <w:i/>
+                <w:iCs/>
+                <w:color w:val="888888"/>
+                <w:sz w:val="19"/>
+                <w:szCs w:val="19"/>
+              </w:rPr>
+              <w:t>5</w:t>
             </w:r>
           </w:p>
         </w:tc>
@@ -39092,6 +38051,7 @@
             <w:r>
               <w:rPr>
                 <w:rFonts w:asciiTheme="majorHAnsi" w:hAnsiTheme="majorHAnsi"/>
+                <w:noProof/>
               </w:rPr>
               <w:drawing>
                 <wp:inline distT="0" distB="0" distL="0" distR="0" wp14:anchorId="13A94847" wp14:editId="60467A66">
@@ -39109,7 +38069,7 @@
                           <pic:cNvPicPr/>
                         </pic:nvPicPr>
                         <pic:blipFill>
-                          <a:blip r:embed="rId43"/>
+                          <a:blip r:embed="rId41"/>
                           <a:stretch>
                             <a:fillRect/>
                           </a:stretch>
@@ -39267,6 +38227,7 @@
             <w:r>
               <w:rPr>
                 <w:rFonts w:asciiTheme="majorHAnsi" w:hAnsiTheme="majorHAnsi"/>
+                <w:noProof/>
               </w:rPr>
               <w:drawing>
                 <wp:inline distT="0" distB="0" distL="0" distR="0" wp14:anchorId="1BFDC646" wp14:editId="71AC2BB7">
@@ -39284,7 +38245,7 @@
                           <pic:cNvPicPr/>
                         </pic:nvPicPr>
                         <pic:blipFill>
-                          <a:blip r:embed="rId44"/>
+                          <a:blip r:embed="rId42"/>
                           <a:stretch>
                             <a:fillRect/>
                           </a:stretch>
@@ -43017,6 +41978,7 @@
             <w:r>
               <w:rPr>
                 <w:rFonts w:asciiTheme="majorHAnsi" w:hAnsiTheme="majorHAnsi"/>
+                <w:noProof/>
               </w:rPr>
               <w:drawing>
                 <wp:inline distT="0" distB="0" distL="0" distR="0" wp14:anchorId="0E230F4C" wp14:editId="093330B7">
@@ -43034,7 +41996,7 @@
                           <pic:cNvPicPr/>
                         </pic:nvPicPr>
                         <pic:blipFill>
-                          <a:blip r:embed="rId43"/>
+                          <a:blip r:embed="rId41"/>
                           <a:stretch>
                             <a:fillRect/>
                           </a:stretch>
@@ -43109,6 +42071,7 @@
             <w:r>
               <w:rPr>
                 <w:rFonts w:asciiTheme="majorHAnsi" w:hAnsiTheme="majorHAnsi"/>
+                <w:noProof/>
               </w:rPr>
               <w:drawing>
                 <wp:inline distT="0" distB="0" distL="0" distR="0" wp14:anchorId="1A9C8822" wp14:editId="7F3CC685">
@@ -43126,7 +42089,7 @@
                           <pic:cNvPicPr/>
                         </pic:nvPicPr>
                         <pic:blipFill rotWithShape="1">
-                          <a:blip r:embed="rId44"/>
+                          <a:blip r:embed="rId42"/>
                           <a:srcRect t="24013"/>
                           <a:stretch>
                             <a:fillRect/>
@@ -43192,18 +42155,7 @@
                 <w:szCs w:val="19"/>
               </w:rPr>
               <w:lastRenderedPageBreak/>
-              <w:t xml:space="preserve">Screenshot </w:t>
-            </w:r>
-            <w:r>
-              <w:rPr>
-                <w:rFonts w:asciiTheme="majorHAnsi" w:hAnsiTheme="majorHAnsi"/>
-                <w:b/>
-                <w:bCs/>
-                <w:color w:val="000000"/>
-                <w:sz w:val="19"/>
-                <w:szCs w:val="19"/>
-              </w:rPr>
-              <w:t>4</w:t>
+              <w:t>Screenshot 4</w:t>
             </w:r>
           </w:p>
         </w:tc>
@@ -43234,6 +42186,7 @@
                 <w:rFonts w:asciiTheme="majorHAnsi" w:hAnsiTheme="majorHAnsi"/>
                 <w:i/>
                 <w:iCs/>
+                <w:noProof/>
                 <w:color w:val="888888"/>
                 <w:sz w:val="19"/>
                 <w:szCs w:val="19"/>
@@ -43254,7 +42207,7 @@
                           <pic:cNvPicPr/>
                         </pic:nvPicPr>
                         <pic:blipFill>
-                          <a:blip r:embed="rId45"/>
+                          <a:blip r:embed="rId43"/>
                           <a:stretch>
                             <a:fillRect/>
                           </a:stretch>
@@ -44821,8 +43774,8 @@
       </w:r>
     </w:p>
     <w:sectPr>
-      <w:headerReference w:type="default" r:id="rId46"/>
-      <w:footerReference w:type="default" r:id="rId47"/>
+      <w:headerReference w:type="default" r:id="rId44"/>
+      <w:footerReference w:type="default" r:id="rId45"/>
       <w:pgSz w:w="12240" w:h="15840"/>
       <w:pgMar w:top="1080" w:right="1080" w:bottom="1080" w:left="1080" w:header="708" w:footer="708" w:gutter="0"/>
       <w:cols w:space="720"/>
@@ -46196,23 +45149,6 @@
 </file>
 
 <file path=customXml/item1.xml><?xml version="1.0" encoding="utf-8"?>
-<p:properties xmlns:p="http://schemas.microsoft.com/office/2006/metadata/properties" xmlns:xsi="http://www.w3.org/2001/XMLSchema-instance" xmlns:pc="http://schemas.microsoft.com/office/infopath/2007/PartnerControls">
-  <documentManagement>
-    <_activity xmlns="29feaa19-7e9c-46bb-9c71-c79ab0e720aa" xsi:nil="true"/>
-  </documentManagement>
-</p:properties>
-</file>
-
-<file path=customXml/item2.xml><?xml version="1.0" encoding="utf-8"?>
-<?mso-contentType ?>
-<FormTemplates xmlns="http://schemas.microsoft.com/sharepoint/v3/contenttype/forms">
-  <Display>DocumentLibraryForm</Display>
-  <Edit>DocumentLibraryForm</Edit>
-  <New>DocumentLibraryForm</New>
-</FormTemplates>
-</file>
-
-<file path=customXml/item3.xml><?xml version="1.0" encoding="utf-8"?>
 <ct:contentTypeSchema xmlns:ct="http://schemas.microsoft.com/office/2006/metadata/contentType" xmlns:ma="http://schemas.microsoft.com/office/2006/metadata/properties/metaAttributes" ct:_="" ma:_="" ma:contentTypeName="Document" ma:contentTypeID="0x0101002D11A792FDAF494C845A5CB9D147B2A6" ma:contentTypeVersion="15" ma:contentTypeDescription="Create a new document." ma:contentTypeScope="" ma:versionID="08b5db1ca532c33d063f8ec7fa6582de">
   <xsd:schema xmlns:xsd="http://www.w3.org/2001/XMLSchema" xmlns:xs="http://www.w3.org/2001/XMLSchema" xmlns:p="http://schemas.microsoft.com/office/2006/metadata/properties" xmlns:ns3="29feaa19-7e9c-46bb-9c71-c79ab0e720aa" xmlns:ns4="537ee0c9-46a7-4914-b26d-0ad5446884e4" targetNamespace="http://schemas.microsoft.com/office/2006/metadata/properties" ma:root="true" ma:fieldsID="0d13a69b323a25cf1d861a6f4b89bcac" ns3:_="" ns4:_="">
     <xsd:import namespace="29feaa19-7e9c-46bb-9c71-c79ab0e720aa"/>
@@ -46445,25 +45381,24 @@
 </ct:contentTypeSchema>
 </file>
 
-<file path=customXml/itemProps1.xml><?xml version="1.0" encoding="utf-8"?>
-<ds:datastoreItem xmlns:ds="http://schemas.openxmlformats.org/officeDocument/2006/customXml" ds:itemID="{52B81A99-E1A1-46C1-8DF2-87A4FE7C30EC}">
-  <ds:schemaRefs>
-    <ds:schemaRef ds:uri="http://schemas.microsoft.com/office/2006/metadata/properties"/>
-    <ds:schemaRef ds:uri="http://schemas.microsoft.com/office/infopath/2007/PartnerControls"/>
-    <ds:schemaRef ds:uri="29feaa19-7e9c-46bb-9c71-c79ab0e720aa"/>
-  </ds:schemaRefs>
-</ds:datastoreItem>
+<file path=customXml/item2.xml><?xml version="1.0" encoding="utf-8"?>
+<p:properties xmlns:p="http://schemas.microsoft.com/office/2006/metadata/properties" xmlns:xsi="http://www.w3.org/2001/XMLSchema-instance" xmlns:pc="http://schemas.microsoft.com/office/infopath/2007/PartnerControls">
+  <documentManagement>
+    <_activity xmlns="29feaa19-7e9c-46bb-9c71-c79ab0e720aa" xsi:nil="true"/>
+  </documentManagement>
+</p:properties>
 </file>
 
-<file path=customXml/itemProps2.xml><?xml version="1.0" encoding="utf-8"?>
-<ds:datastoreItem xmlns:ds="http://schemas.openxmlformats.org/officeDocument/2006/customXml" ds:itemID="{3257534C-0F8D-477B-8205-ED5C47A2E27D}">
-  <ds:schemaRefs>
-    <ds:schemaRef ds:uri="http://schemas.microsoft.com/sharepoint/v3/contenttype/forms"/>
-  </ds:schemaRefs>
-</ds:datastoreItem>
+<file path=customXml/item3.xml><?xml version="1.0" encoding="utf-8"?>
+<?mso-contentType ?>
+<FormTemplates xmlns="http://schemas.microsoft.com/sharepoint/v3/contenttype/forms">
+  <Display>DocumentLibraryForm</Display>
+  <Edit>DocumentLibraryForm</Edit>
+  <New>DocumentLibraryForm</New>
+</FormTemplates>
 </file>
 
-<file path=customXml/itemProps3.xml><?xml version="1.0" encoding="utf-8"?>
+<file path=customXml/itemProps1.xml><?xml version="1.0" encoding="utf-8"?>
 <ds:datastoreItem xmlns:ds="http://schemas.openxmlformats.org/officeDocument/2006/customXml" ds:itemID="{A31400D9-674F-47A8-B987-CF1661C865A9}">
   <ds:schemaRefs>
     <ds:schemaRef ds:uri="http://schemas.microsoft.com/office/2006/metadata/contentType"/>
@@ -46480,4 +45415,22 @@
     <ds:schemaRef ds:uri="http://schemas.microsoft.com/internal/obd"/>
   </ds:schemaRefs>
 </ds:datastoreItem>
+</file>
+
+<file path=customXml/itemProps2.xml><?xml version="1.0" encoding="utf-8"?>
+<ds:datastoreItem xmlns:ds="http://schemas.openxmlformats.org/officeDocument/2006/customXml" ds:itemID="{52B81A99-E1A1-46C1-8DF2-87A4FE7C30EC}">
+  <ds:schemaRefs>
+    <ds:schemaRef ds:uri="http://schemas.microsoft.com/office/2006/metadata/properties"/>
+    <ds:schemaRef ds:uri="http://schemas.microsoft.com/office/infopath/2007/PartnerControls"/>
+    <ds:schemaRef ds:uri="29feaa19-7e9c-46bb-9c71-c79ab0e720aa"/>
+  </ds:schemaRefs>
+</ds:datastoreItem>
+</file>
+
+<file path=customXml/itemProps3.xml><?xml version="1.0" encoding="utf-8"?>
+<ds:datastoreItem xmlns:ds="http://schemas.openxmlformats.org/officeDocument/2006/customXml" ds:itemID="{3257534C-0F8D-477B-8205-ED5C47A2E27D}">
+  <ds:schemaRefs>
+    <ds:schemaRef ds:uri="http://schemas.microsoft.com/sharepoint/v3/contenttype/forms"/>
+  </ds:schemaRefs>
+</ds:datastoreItem>
 </file>
</xml_diff>